<commit_message>
docs: update InternTrack Progress Report for latest system checkup
Refresh the Updated Progress Report DOCX with the latest verified system checkup and survey progress notes for the capstone deliverable.

Co-authored-by: Cursor <cursoragent@cursor.com>
</commit_message>
<xml_diff>
--- a/InternTrack_Progress_Report_Updated.docx
+++ b/InternTrack_Progress_Report_Updated.docx
@@ -230,7 +230,7 @@
         <w:rPr>
           <w:rFonts w:ascii="Century Gothic" w:eastAsia="Calibri" w:hAnsi="Century Gothic" w:cs="Calibri"/>
         </w:rPr>
-        <w:t>Date: July 18, 2026</w:t>
+        <w:t>Date: July 21, 2026</w:t>
       </w:r>
     </w:p>
     <w:p>
@@ -287,7 +287,7 @@
           <w:sz w:val="18"/>
           <w:szCs w:val="18"/>
         </w:rPr>
-        <w:t>The table below presents the objectives and scope of the INTERNTRACK system, along with their corresponding development updates, percentage of completion, and explanations based on the current React + Laravel implementation (as of July 18, 2026).</w:t>
+        <w:t>The table below presents the objectives and scope of the INTERNTRACK system, along with their corresponding development updates, percentage of completion, and explanations based on the current React + Laravel implementation (as of July 21, 2026).</w:t>
       </w:r>
     </w:p>
     <w:tbl>
@@ -309,19 +309,13 @@
         <w:tblLook w:val="04A0" w:firstRow="1" w:lastRow="0" w:firstColumn="1" w:lastColumn="0" w:noHBand="0" w:noVBand="1"/>
       </w:tblPr>
       <w:tblGrid>
-        <w:gridCol w:w="2169"/>
-        <w:gridCol w:w="2126"/>
-        <w:gridCol w:w="875"/>
-        <w:gridCol w:w="1245"/>
-        <w:gridCol w:w="5195"/>
+        <w:gridCol w:w="1761"/>
+        <w:gridCol w:w="3593"/>
+        <w:gridCol w:w="656"/>
+        <w:gridCol w:w="2724"/>
+        <w:gridCol w:w="2876"/>
       </w:tblGrid>
       <w:tr>
-        <w:tblPrEx>
-          <w:tblCellMar>
-            <w:top w:w="0" w:type="dxa"/>
-            <w:bottom w:w="0" w:type="dxa"/>
-          </w:tblCellMar>
-        </w:tblPrEx>
         <w:trPr>
           <w:tblHeader/>
         </w:trPr>
@@ -377,8 +371,25 @@
                 <w:sz w:val="18"/>
                 <w:szCs w:val="18"/>
               </w:rPr>
-              <w:t xml:space="preserve">Development </w:t>
-            </w:r>
+              <w:t>Development Update</w:t>
+            </w:r>
+          </w:p>
+        </w:tc>
+        <w:tc>
+          <w:tcPr>
+            <w:tcW w:w="875" w:type="dxa"/>
+            <w:shd w:val="clear" w:color="auto" w:fill="1F497D"/>
+            <w:vAlign w:val="center"/>
+          </w:tcPr>
+          <w:p>
+            <w:pPr>
+              <w:jc w:val="center"/>
+              <w:rPr>
+                <w:rFonts w:ascii="Century Gothic" w:hAnsi="Century Gothic"/>
+                <w:sz w:val="18"/>
+                <w:szCs w:val="18"/>
+              </w:rPr>
+            </w:pPr>
             <w:r>
               <w:rPr>
                 <w:rFonts w:ascii="Century Gothic" w:eastAsia="Calibri" w:hAnsi="Century Gothic" w:cs="Calibri"/>
@@ -388,13 +399,13 @@
                 <w:sz w:val="18"/>
                 <w:szCs w:val="18"/>
               </w:rPr>
-              <w:t>Update</w:t>
-            </w:r>
-          </w:p>
-        </w:tc>
-        <w:tc>
-          <w:tcPr>
-            <w:tcW w:w="875" w:type="dxa"/>
+              <w:t>% Done</w:t>
+            </w:r>
+          </w:p>
+        </w:tc>
+        <w:tc>
+          <w:tcPr>
+            <w:tcW w:w="1245" w:type="dxa"/>
             <w:shd w:val="clear" w:color="auto" w:fill="1F497D"/>
             <w:vAlign w:val="center"/>
           </w:tcPr>
@@ -416,13 +427,13 @@
                 <w:sz w:val="18"/>
                 <w:szCs w:val="18"/>
               </w:rPr>
-              <w:t>% Done</w:t>
-            </w:r>
-          </w:p>
-        </w:tc>
-        <w:tc>
-          <w:tcPr>
-            <w:tcW w:w="1245" w:type="dxa"/>
+              <w:t>Explanation / Notes</w:t>
+            </w:r>
+          </w:p>
+        </w:tc>
+        <w:tc>
+          <w:tcPr>
+            <w:tcW w:w="5195" w:type="dxa"/>
             <w:shd w:val="clear" w:color="auto" w:fill="1F497D"/>
             <w:vAlign w:val="center"/>
           </w:tcPr>
@@ -444,19 +455,20 @@
                 <w:sz w:val="18"/>
                 <w:szCs w:val="18"/>
               </w:rPr>
-              <w:t>Explanation / Notes</w:t>
-            </w:r>
-          </w:p>
-        </w:tc>
-        <w:tc>
-          <w:tcPr>
-            <w:tcW w:w="5195" w:type="dxa"/>
-            <w:shd w:val="clear" w:color="auto" w:fill="1F497D"/>
-            <w:vAlign w:val="center"/>
-          </w:tcPr>
-          <w:p>
-            <w:pPr>
-              <w:jc w:val="center"/>
+              <w:t>Progress Screenshots</w:t>
+            </w:r>
+          </w:p>
+        </w:tc>
+      </w:tr>
+      <w:tr>
+        <w:tc>
+          <w:tcPr>
+            <w:tcW w:w="2169" w:type="dxa"/>
+            <w:shd w:val="clear" w:color="auto" w:fill="DCE6F1"/>
+          </w:tcPr>
+          <w:p>
+            <w:pPr>
+              <w:spacing w:before="80" w:after="40"/>
               <w:rPr>
                 <w:rFonts w:ascii="Century Gothic" w:hAnsi="Century Gothic"/>
                 <w:sz w:val="18"/>
@@ -468,41 +480,6 @@
                 <w:rFonts w:ascii="Century Gothic" w:eastAsia="Calibri" w:hAnsi="Century Gothic" w:cs="Calibri"/>
                 <w:b/>
                 <w:bCs/>
-                <w:color w:val="FFFFFF"/>
-                <w:sz w:val="18"/>
-                <w:szCs w:val="18"/>
-              </w:rPr>
-              <w:t>Progress Screenshots</w:t>
-            </w:r>
-          </w:p>
-        </w:tc>
-      </w:tr>
-      <w:tr>
-        <w:tblPrEx>
-          <w:tblCellMar>
-            <w:top w:w="0" w:type="dxa"/>
-            <w:bottom w:w="0" w:type="dxa"/>
-          </w:tblCellMar>
-        </w:tblPrEx>
-        <w:tc>
-          <w:tcPr>
-            <w:tcW w:w="2169" w:type="dxa"/>
-            <w:shd w:val="clear" w:color="auto" w:fill="DCE6F1"/>
-          </w:tcPr>
-          <w:p>
-            <w:pPr>
-              <w:spacing w:before="80" w:after="40"/>
-              <w:rPr>
-                <w:rFonts w:ascii="Century Gothic" w:hAnsi="Century Gothic"/>
-                <w:sz w:val="18"/>
-                <w:szCs w:val="18"/>
-              </w:rPr>
-            </w:pPr>
-            <w:r>
-              <w:rPr>
-                <w:rFonts w:ascii="Century Gothic" w:eastAsia="Calibri" w:hAnsi="Century Gothic" w:cs="Calibri"/>
-                <w:b/>
-                <w:bCs/>
                 <w:sz w:val="18"/>
                 <w:szCs w:val="18"/>
               </w:rPr>
@@ -524,15 +501,7 @@
                 <w:sz w:val="18"/>
                 <w:szCs w:val="18"/>
               </w:rPr>
-              <w:t>Manages student profiles and records through centralized data storage and profile management; enables administrators to tag internship status (active, completed, suspended, deferred, expelled) with a mandatory reason for status changes; protects access thr</w:t>
-            </w:r>
-            <w:r>
-              <w:rPr>
-                <w:rFonts w:ascii="Century Gothic" w:eastAsia="Calibri" w:hAnsi="Century Gothic" w:cs="Calibri"/>
-                <w:sz w:val="18"/>
-                <w:szCs w:val="18"/>
-              </w:rPr>
-              <w:t>ough role-based access control.</w:t>
+              <w:t>Manages student profiles and records through centralized data storage and profile management; enables administrators to tag internship status (active, completed, suspended, deferred, expelled) with a mandatory reason for status changes; protects access through role-based access control.</w:t>
             </w:r>
           </w:p>
         </w:tc>
@@ -552,18 +521,10 @@
             <w:r>
               <w:rPr>
                 <w:rFonts w:ascii="Century Gothic" w:eastAsia="Calibri" w:hAnsi="Century Gothic" w:cs="Calibri"/>
-                <w:b w:val="0"/>
-                <w:sz w:val="18"/>
-                <w:szCs w:val="18"/>
-              </w:rPr>
-              <w:t>Implemented on React (Vite) + Laravel 12 with Sanctum authentication and MySQL persistence. Student profiles auto-provision via MISD integration service; centralized records exist for Student, Supervisor, Faculty, Coordinator, and Director. Role-based route and API guards protect access. Per-user Settings (profile, password, avatar upload with storage persistence) are working. Internship status is tracked through the internship lifecycle and placement assignment.</w:t>
-            </w:r>
-            <w:r>
-              <w:rPr>
-                <w:rFonts w:ascii="Century Gothic" w:eastAsia="Calibri" w:hAnsi="Century Gothic" w:cs="Calibri"/>
-                <w:sz w:val="18"/>
-                <w:szCs w:val="18"/>
-              </w:rPr>
+                <w:sz w:val="18"/>
+                <w:szCs w:val="18"/>
+              </w:rPr>
+              <w:t>Implemented on React (Vite) + Laravel 12 with Sanctum authentication and MySQL persistence. Student profiles auto-provision via MISD integration service; centralized records exist for Student, Supervisor, Faculty, Coordinator, and Director. Role-based route and API guards protect access. Per-user Settings (profile, password, avatar upload with storage persistence) are working. Internship status is tracked through the internship lifecycle and placement assignment. Status tagging with mandatory reason and profile persistence were reconfirmed in the latest checkup.</w:t>
             </w:r>
           </w:p>
         </w:tc>
@@ -610,7 +571,6 @@
             <w:r>
               <w:rPr>
                 <w:rFonts w:ascii="Century Gothic" w:eastAsia="Calibri" w:hAnsi="Century Gothic" w:cs="Calibri"/>
-                <w:b w:val="0"/>
                 <w:sz w:val="18"/>
                 <w:szCs w:val="18"/>
               </w:rPr>
@@ -632,68 +592,6 @@
                 <w:szCs w:val="18"/>
               </w:rPr>
             </w:pPr>
-            <w:r>
-              <w:rPr>
-                <w:rFonts w:ascii="Century Gothic" w:hAnsi="Century Gothic"/>
-                <w:sz w:val="18"/>
-                <w:szCs w:val="18"/>
-              </w:rPr>
-              <w:drawing>
-                <wp:anchor distT="0" distB="0" distL="114300" distR="114300" simplePos="0" relativeHeight="251660288" behindDoc="1" locked="0" layoutInCell="1" allowOverlap="1" wp14:anchorId="6A94F425" wp14:editId="59237715">
-                  <wp:simplePos x="0" y="0"/>
-                  <wp:positionH relativeFrom="column">
-                    <wp:posOffset>73025</wp:posOffset>
-                  </wp:positionH>
-                  <wp:positionV relativeFrom="paragraph">
-                    <wp:posOffset>-40005</wp:posOffset>
-                  </wp:positionV>
-                  <wp:extent cx="3057525" cy="1301750"/>
-                  <wp:effectExtent l="0" t="0" r="9525" b="0"/>
-                  <wp:wrapNone/>
-                  <wp:docPr id="1" name="Picture 1"/>
-                  <wp:cNvGraphicFramePr>
-                    <a:graphicFrameLocks xmlns:a="http://schemas.openxmlformats.org/drawingml/2006/main" noChangeAspect="1"/>
-                  </wp:cNvGraphicFramePr>
-                  <a:graphic xmlns:a="http://schemas.openxmlformats.org/drawingml/2006/main">
-                    <a:graphicData uri="http://schemas.openxmlformats.org/drawingml/2006/picture">
-                      <pic:pic xmlns:pic="http://schemas.openxmlformats.org/drawingml/2006/picture">
-                        <pic:nvPicPr>
-                          <pic:cNvPr id="1" name=""/>
-                          <pic:cNvPicPr/>
-                        </pic:nvPicPr>
-                        <pic:blipFill>
-                          <a:blip r:embed="rId7" cstate="print">
-                            <a:extLst>
-                              <a:ext uri="{28A0092B-C50C-407E-A947-70E740481C1C}">
-                                <a14:useLocalDpi xmlns:a14="http://schemas.microsoft.com/office/drawing/2010/main" val="0"/>
-                              </a:ext>
-                            </a:extLst>
-                          </a:blip>
-                          <a:stretch>
-                            <a:fillRect/>
-                          </a:stretch>
-                        </pic:blipFill>
-                        <pic:spPr>
-                          <a:xfrm>
-                            <a:off x="0" y="0"/>
-                            <a:ext cx="3057525" cy="1301750"/>
-                          </a:xfrm>
-                          <a:prstGeom prst="rect">
-                            <a:avLst/>
-                          </a:prstGeom>
-                        </pic:spPr>
-                      </pic:pic>
-                    </a:graphicData>
-                  </a:graphic>
-                  <wp14:sizeRelH relativeFrom="page">
-                    <wp14:pctWidth>0</wp14:pctWidth>
-                  </wp14:sizeRelH>
-                  <wp14:sizeRelV relativeFrom="page">
-                    <wp14:pctHeight>0</wp14:pctHeight>
-                  </wp14:sizeRelV>
-                </wp:anchor>
-              </w:drawing>
-            </w:r>
           </w:p>
           <w:p>
             <w:pPr>
@@ -714,78 +612,10 @@
                 <w:szCs w:val="18"/>
               </w:rPr>
             </w:pPr>
-            <w:r>
-              <w:rPr>
-                <w:rFonts w:ascii="Century Gothic" w:hAnsi="Century Gothic"/>
-                <w:sz w:val="18"/>
-                <w:szCs w:val="18"/>
-              </w:rPr>
-              <w:drawing>
-                <wp:anchor distT="0" distB="0" distL="114300" distR="114300" simplePos="0" relativeHeight="251662336" behindDoc="1" locked="0" layoutInCell="1" allowOverlap="1" wp14:anchorId="4701A7C9" wp14:editId="62B7F63D">
-                  <wp:simplePos x="0" y="0"/>
-                  <wp:positionH relativeFrom="column">
-                    <wp:posOffset>76835</wp:posOffset>
-                  </wp:positionH>
-                  <wp:positionV relativeFrom="paragraph">
-                    <wp:posOffset>1097280</wp:posOffset>
-                  </wp:positionV>
-                  <wp:extent cx="3057525" cy="1301750"/>
-                  <wp:effectExtent l="0" t="0" r="9525" b="0"/>
-                  <wp:wrapNone/>
-                  <wp:docPr id="10" name="Picture 10"/>
-                  <wp:cNvGraphicFramePr>
-                    <a:graphicFrameLocks xmlns:a="http://schemas.openxmlformats.org/drawingml/2006/main" noChangeAspect="1"/>
-                  </wp:cNvGraphicFramePr>
-                  <a:graphic xmlns:a="http://schemas.openxmlformats.org/drawingml/2006/main">
-                    <a:graphicData uri="http://schemas.openxmlformats.org/drawingml/2006/picture">
-                      <pic:pic xmlns:pic="http://schemas.openxmlformats.org/drawingml/2006/picture">
-                        <pic:nvPicPr>
-                          <pic:cNvPr id="10" name="Picture 10"/>
-                          <pic:cNvPicPr/>
-                        </pic:nvPicPr>
-                        <pic:blipFill>
-                          <a:blip r:embed="rId8" cstate="print">
-                            <a:extLst>
-                              <a:ext uri="{28A0092B-C50C-407E-A947-70E740481C1C}">
-                                <a14:useLocalDpi xmlns:a14="http://schemas.microsoft.com/office/drawing/2010/main" val="0"/>
-                              </a:ext>
-                            </a:extLst>
-                          </a:blip>
-                          <a:stretch>
-                            <a:fillRect/>
-                          </a:stretch>
-                        </pic:blipFill>
-                        <pic:spPr>
-                          <a:xfrm>
-                            <a:off x="0" y="0"/>
-                            <a:ext cx="3057525" cy="1301750"/>
-                          </a:xfrm>
-                          <a:prstGeom prst="rect">
-                            <a:avLst/>
-                          </a:prstGeom>
-                        </pic:spPr>
-                      </pic:pic>
-                    </a:graphicData>
-                  </a:graphic>
-                  <wp14:sizeRelH relativeFrom="page">
-                    <wp14:pctWidth>0</wp14:pctWidth>
-                  </wp14:sizeRelH>
-                  <wp14:sizeRelV relativeFrom="page">
-                    <wp14:pctHeight>0</wp14:pctHeight>
-                  </wp14:sizeRelV>
-                </wp:anchor>
-              </w:drawing>
-            </w:r>
           </w:p>
         </w:tc>
       </w:tr>
       <w:tr>
-        <w:tblPrEx>
-          <w:tblCellMar>
-            <w:top w:w="0" w:type="dxa"/>
-            <w:bottom w:w="0" w:type="dxa"/>
-          </w:tblCellMar>
-        </w:tblPrEx>
         <w:trPr>
           <w:trHeight w:val="4076"/>
         </w:trPr>
@@ -849,18 +679,10 @@
             <w:r>
               <w:rPr>
                 <w:rFonts w:ascii="Century Gothic" w:eastAsia="Calibri" w:hAnsi="Century Gothic" w:cs="Calibri"/>
-                <w:b w:val="0"/>
                 <w:sz w:val="18"/>
                 <w:szCs w:val="18"/>
               </w:rPr>
               <w:t>Internship lifecycle is live: pending placement -&gt; company/faculty/supervisor/coordinator assignment -&gt; ongoing monitoring. Director MOA monitoring and company management are implemented. Coordinator monitoring/records and student progress dashboards use live API data. QR-based HTE supervisor self-registration with invite tokens and coordinator approval is operational.</w:t>
-            </w:r>
-            <w:r>
-              <w:rPr>
-                <w:rFonts w:ascii="Century Gothic" w:eastAsia="Calibri" w:hAnsi="Century Gothic" w:cs="Calibri"/>
-                <w:sz w:val="18"/>
-                <w:szCs w:val="18"/>
-              </w:rPr>
             </w:r>
           </w:p>
         </w:tc>
@@ -907,18 +729,10 @@
             <w:r>
               <w:rPr>
                 <w:rFonts w:ascii="Century Gothic" w:eastAsia="Calibri" w:hAnsi="Century Gothic" w:cs="Calibri"/>
-                <w:b w:val="0"/>
                 <w:sz w:val="18"/>
                 <w:szCs w:val="18"/>
               </w:rPr>
               <w:t>Placement, deployment tracking, MOA screens, and supervisor onboarding work. Remaining: deeper automated MOA/HTE accreditation blocking rules and richer at-risk escalation.</w:t>
-            </w:r>
-            <w:r>
-              <w:rPr>
-                <w:rFonts w:ascii="Century Gothic" w:eastAsia="Calibri" w:hAnsi="Century Gothic" w:cs="Calibri"/>
-                <w:sz w:val="18"/>
-                <w:szCs w:val="18"/>
-              </w:rPr>
             </w:r>
           </w:p>
         </w:tc>
@@ -936,68 +750,6 @@
                 <w:szCs w:val="18"/>
               </w:rPr>
             </w:pPr>
-            <w:r>
-              <w:rPr>
-                <w:rFonts w:ascii="Century Gothic" w:hAnsi="Century Gothic"/>
-                <w:sz w:val="18"/>
-                <w:szCs w:val="18"/>
-              </w:rPr>
-              <w:drawing>
-                <wp:anchor distT="0" distB="0" distL="114300" distR="114300" simplePos="0" relativeHeight="251664384" behindDoc="1" locked="0" layoutInCell="1" allowOverlap="1" wp14:anchorId="66BE0141" wp14:editId="4CFCA96C">
-                  <wp:simplePos x="0" y="0"/>
-                  <wp:positionH relativeFrom="column">
-                    <wp:posOffset>80645</wp:posOffset>
-                  </wp:positionH>
-                  <wp:positionV relativeFrom="paragraph">
-                    <wp:posOffset>73025</wp:posOffset>
-                  </wp:positionV>
-                  <wp:extent cx="3051810" cy="1301750"/>
-                  <wp:effectExtent l="0" t="0" r="0" b="0"/>
-                  <wp:wrapNone/>
-                  <wp:docPr id="11" name="Picture 11"/>
-                  <wp:cNvGraphicFramePr>
-                    <a:graphicFrameLocks xmlns:a="http://schemas.openxmlformats.org/drawingml/2006/main" noChangeAspect="1"/>
-                  </wp:cNvGraphicFramePr>
-                  <a:graphic xmlns:a="http://schemas.openxmlformats.org/drawingml/2006/main">
-                    <a:graphicData uri="http://schemas.openxmlformats.org/drawingml/2006/picture">
-                      <pic:pic xmlns:pic="http://schemas.openxmlformats.org/drawingml/2006/picture">
-                        <pic:nvPicPr>
-                          <pic:cNvPr id="11" name="Picture 11"/>
-                          <pic:cNvPicPr/>
-                        </pic:nvPicPr>
-                        <pic:blipFill>
-                          <a:blip r:embed="rId9" cstate="print">
-                            <a:extLst>
-                              <a:ext uri="{28A0092B-C50C-407E-A947-70E740481C1C}">
-                                <a14:useLocalDpi xmlns:a14="http://schemas.microsoft.com/office/drawing/2010/main" val="0"/>
-                              </a:ext>
-                            </a:extLst>
-                          </a:blip>
-                          <a:stretch>
-                            <a:fillRect/>
-                          </a:stretch>
-                        </pic:blipFill>
-                        <pic:spPr>
-                          <a:xfrm>
-                            <a:off x="0" y="0"/>
-                            <a:ext cx="3051810" cy="1301750"/>
-                          </a:xfrm>
-                          <a:prstGeom prst="rect">
-                            <a:avLst/>
-                          </a:prstGeom>
-                        </pic:spPr>
-                      </pic:pic>
-                    </a:graphicData>
-                  </a:graphic>
-                  <wp14:sizeRelH relativeFrom="page">
-                    <wp14:pctWidth>0</wp14:pctWidth>
-                  </wp14:sizeRelH>
-                  <wp14:sizeRelV relativeFrom="page">
-                    <wp14:pctHeight>0</wp14:pctHeight>
-                  </wp14:sizeRelV>
-                </wp:anchor>
-              </w:drawing>
-            </w:r>
           </w:p>
           <w:p>
             <w:pPr>
@@ -1011,239 +763,6 @@
           </w:p>
           <w:p>
             <w:pPr>
-              <w:jc w:val="center"/>
-              <w:rPr>
-                <w:rFonts w:ascii="Century Gothic" w:hAnsi="Century Gothic"/>
-                <w:sz w:val="18"/>
-                <w:szCs w:val="18"/>
-              </w:rPr>
-            </w:pPr>
-          </w:p>
-          <w:p>
-            <w:pPr>
-              <w:jc w:val="center"/>
-              <w:rPr>
-                <w:rFonts w:ascii="Century Gothic" w:hAnsi="Century Gothic"/>
-                <w:sz w:val="18"/>
-                <w:szCs w:val="18"/>
-              </w:rPr>
-            </w:pPr>
-          </w:p>
-          <w:p>
-            <w:pPr>
-              <w:jc w:val="center"/>
-              <w:rPr>
-                <w:rFonts w:ascii="Century Gothic" w:hAnsi="Century Gothic"/>
-                <w:sz w:val="18"/>
-                <w:szCs w:val="18"/>
-              </w:rPr>
-            </w:pPr>
-          </w:p>
-          <w:p>
-            <w:pPr>
-              <w:jc w:val="center"/>
-              <w:rPr>
-                <w:rFonts w:ascii="Century Gothic" w:hAnsi="Century Gothic"/>
-                <w:sz w:val="18"/>
-                <w:szCs w:val="18"/>
-              </w:rPr>
-            </w:pPr>
-          </w:p>
-          <w:p>
-            <w:pPr>
-              <w:jc w:val="center"/>
-              <w:rPr>
-                <w:rFonts w:ascii="Century Gothic" w:hAnsi="Century Gothic"/>
-                <w:sz w:val="18"/>
-                <w:szCs w:val="18"/>
-              </w:rPr>
-            </w:pPr>
-          </w:p>
-          <w:p>
-            <w:pPr>
-              <w:jc w:val="center"/>
-              <w:rPr>
-                <w:rFonts w:ascii="Century Gothic" w:hAnsi="Century Gothic"/>
-                <w:sz w:val="18"/>
-                <w:szCs w:val="18"/>
-              </w:rPr>
-            </w:pPr>
-          </w:p>
-          <w:p>
-            <w:pPr>
-              <w:jc w:val="center"/>
-              <w:rPr>
-                <w:rFonts w:ascii="Century Gothic" w:hAnsi="Century Gothic"/>
-                <w:sz w:val="18"/>
-                <w:szCs w:val="18"/>
-              </w:rPr>
-            </w:pPr>
-          </w:p>
-          <w:p>
-            <w:pPr>
-              <w:jc w:val="center"/>
-              <w:rPr>
-                <w:rFonts w:ascii="Century Gothic" w:hAnsi="Century Gothic"/>
-                <w:sz w:val="18"/>
-                <w:szCs w:val="18"/>
-              </w:rPr>
-            </w:pPr>
-            <w:r>
-              <w:rPr>
-                <w:rFonts w:ascii="Century Gothic" w:hAnsi="Century Gothic"/>
-                <w:sz w:val="18"/>
-                <w:szCs w:val="18"/>
-              </w:rPr>
-              <w:drawing>
-                <wp:anchor distT="0" distB="0" distL="114300" distR="114300" simplePos="0" relativeHeight="251666432" behindDoc="1" locked="0" layoutInCell="1" allowOverlap="1" wp14:anchorId="29B118A0" wp14:editId="3E5ECFDA">
-                  <wp:simplePos x="0" y="0"/>
-                  <wp:positionH relativeFrom="column">
-                    <wp:posOffset>80645</wp:posOffset>
-                  </wp:positionH>
-                  <wp:positionV relativeFrom="paragraph">
-                    <wp:posOffset>139065</wp:posOffset>
-                  </wp:positionV>
-                  <wp:extent cx="3051810" cy="1301750"/>
-                  <wp:effectExtent l="0" t="0" r="0" b="0"/>
-                  <wp:wrapNone/>
-                  <wp:docPr id="13" name="Picture 13"/>
-                  <wp:cNvGraphicFramePr>
-                    <a:graphicFrameLocks xmlns:a="http://schemas.openxmlformats.org/drawingml/2006/main" noChangeAspect="1"/>
-                  </wp:cNvGraphicFramePr>
-                  <a:graphic xmlns:a="http://schemas.openxmlformats.org/drawingml/2006/main">
-                    <a:graphicData uri="http://schemas.openxmlformats.org/drawingml/2006/picture">
-                      <pic:pic xmlns:pic="http://schemas.openxmlformats.org/drawingml/2006/picture">
-                        <pic:nvPicPr>
-                          <pic:cNvPr id="13" name="Picture 13"/>
-                          <pic:cNvPicPr/>
-                        </pic:nvPicPr>
-                        <pic:blipFill>
-                          <a:blip r:embed="rId10" cstate="print">
-                            <a:extLst>
-                              <a:ext uri="{28A0092B-C50C-407E-A947-70E740481C1C}">
-                                <a14:useLocalDpi xmlns:a14="http://schemas.microsoft.com/office/drawing/2010/main" val="0"/>
-                              </a:ext>
-                            </a:extLst>
-                          </a:blip>
-                          <a:stretch>
-                            <a:fillRect/>
-                          </a:stretch>
-                        </pic:blipFill>
-                        <pic:spPr>
-                          <a:xfrm>
-                            <a:off x="0" y="0"/>
-                            <a:ext cx="3051810" cy="1301750"/>
-                          </a:xfrm>
-                          <a:prstGeom prst="rect">
-                            <a:avLst/>
-                          </a:prstGeom>
-                        </pic:spPr>
-                      </pic:pic>
-                    </a:graphicData>
-                  </a:graphic>
-                  <wp14:sizeRelH relativeFrom="page">
-                    <wp14:pctWidth>0</wp14:pctWidth>
-                  </wp14:sizeRelH>
-                  <wp14:sizeRelV relativeFrom="page">
-                    <wp14:pctHeight>0</wp14:pctHeight>
-                  </wp14:sizeRelV>
-                </wp:anchor>
-              </w:drawing>
-            </w:r>
-          </w:p>
-          <w:p>
-            <w:pPr>
-              <w:jc w:val="center"/>
-              <w:rPr>
-                <w:rFonts w:ascii="Century Gothic" w:hAnsi="Century Gothic"/>
-                <w:sz w:val="18"/>
-                <w:szCs w:val="18"/>
-              </w:rPr>
-            </w:pPr>
-          </w:p>
-          <w:p>
-            <w:pPr>
-              <w:jc w:val="center"/>
-              <w:rPr>
-                <w:rFonts w:ascii="Century Gothic" w:hAnsi="Century Gothic"/>
-                <w:sz w:val="18"/>
-                <w:szCs w:val="18"/>
-              </w:rPr>
-            </w:pPr>
-          </w:p>
-          <w:p>
-            <w:pPr>
-              <w:jc w:val="center"/>
-              <w:rPr>
-                <w:rFonts w:ascii="Century Gothic" w:hAnsi="Century Gothic"/>
-                <w:sz w:val="18"/>
-                <w:szCs w:val="18"/>
-              </w:rPr>
-            </w:pPr>
-          </w:p>
-          <w:p>
-            <w:pPr>
-              <w:jc w:val="center"/>
-              <w:rPr>
-                <w:rFonts w:ascii="Century Gothic" w:hAnsi="Century Gothic"/>
-                <w:sz w:val="18"/>
-                <w:szCs w:val="18"/>
-              </w:rPr>
-            </w:pPr>
-          </w:p>
-          <w:p>
-            <w:pPr>
-              <w:jc w:val="center"/>
-              <w:rPr>
-                <w:rFonts w:ascii="Century Gothic" w:hAnsi="Century Gothic"/>
-                <w:sz w:val="18"/>
-                <w:szCs w:val="18"/>
-              </w:rPr>
-            </w:pPr>
-          </w:p>
-          <w:p>
-            <w:pPr>
-              <w:jc w:val="center"/>
-              <w:rPr>
-                <w:rFonts w:ascii="Century Gothic" w:hAnsi="Century Gothic"/>
-                <w:sz w:val="18"/>
-                <w:szCs w:val="18"/>
-              </w:rPr>
-            </w:pPr>
-          </w:p>
-          <w:p>
-            <w:pPr>
-              <w:jc w:val="center"/>
-              <w:rPr>
-                <w:rFonts w:ascii="Century Gothic" w:hAnsi="Century Gothic"/>
-                <w:sz w:val="18"/>
-                <w:szCs w:val="18"/>
-              </w:rPr>
-            </w:pPr>
-          </w:p>
-          <w:p>
-            <w:pPr>
-              <w:jc w:val="center"/>
-              <w:rPr>
-                <w:rFonts w:ascii="Century Gothic" w:hAnsi="Century Gothic"/>
-                <w:sz w:val="18"/>
-                <w:szCs w:val="18"/>
-              </w:rPr>
-            </w:pPr>
-          </w:p>
-          <w:p>
-            <w:pPr>
-              <w:jc w:val="center"/>
-              <w:rPr>
-                <w:rFonts w:ascii="Century Gothic" w:hAnsi="Century Gothic"/>
-                <w:sz w:val="18"/>
-                <w:szCs w:val="18"/>
-              </w:rPr>
-            </w:pPr>
-          </w:p>
-          <w:p>
-            <w:pPr>
-              <w:jc w:val="center"/>
               <w:rPr>
                 <w:rFonts w:ascii="Century Gothic" w:hAnsi="Century Gothic"/>
                 <w:sz w:val="18"/>
@@ -1254,12 +773,6 @@
         </w:tc>
       </w:tr>
       <w:tr>
-        <w:tblPrEx>
-          <w:tblCellMar>
-            <w:top w:w="0" w:type="dxa"/>
-            <w:bottom w:w="0" w:type="dxa"/>
-          </w:tblCellMar>
-        </w:tblPrEx>
         <w:trPr>
           <w:trHeight w:val="4634"/>
         </w:trPr>
@@ -1304,15 +817,7 @@
                 <w:sz w:val="18"/>
                 <w:szCs w:val="18"/>
               </w:rPr>
-              <w:t>Facilitates internship documentation, including digital journal submission and review, and document compliance, submission, verification, and routing</w:t>
-            </w:r>
-            <w:r>
-              <w:rPr>
-                <w:rFonts w:ascii="Century Gothic" w:eastAsia="Calibri" w:hAnsi="Century Gothic" w:cs="Calibri"/>
-                <w:sz w:val="18"/>
-                <w:szCs w:val="18"/>
-              </w:rPr>
-              <w:t>.</w:t>
+              <w:t>Facilitates internship documentation, including digital journal submission and review, and document compliance, submission, verification, and routing.</w:t>
             </w:r>
           </w:p>
         </w:tc>
@@ -1332,18 +837,10 @@
             <w:r>
               <w:rPr>
                 <w:rFonts w:ascii="Century Gothic" w:eastAsia="Calibri" w:hAnsi="Century Gothic" w:cs="Calibri"/>
-                <w:b w:val="0"/>
                 <w:sz w:val="18"/>
                 <w:szCs w:val="18"/>
               </w:rPr>
               <w:t>Document upload/review is live for students and coordinators, including approve/reject with remarks, notifications, and bulk document actions. Attendance clock-in/out, supervisor validation (including bulk validate), weekly journals/logbooks, and faculty/supervisor evaluations are implemented end-to-end against the database.</w:t>
-            </w:r>
-            <w:r>
-              <w:rPr>
-                <w:rFonts w:ascii="Century Gothic" w:eastAsia="Calibri" w:hAnsi="Century Gothic" w:cs="Calibri"/>
-                <w:sz w:val="18"/>
-                <w:szCs w:val="18"/>
-              </w:rPr>
             </w:r>
           </w:p>
         </w:tc>
@@ -1390,7 +887,6 @@
             <w:r>
               <w:rPr>
                 <w:rFonts w:ascii="Century Gothic" w:eastAsia="Calibri" w:hAnsi="Century Gothic" w:cs="Calibri"/>
-                <w:b w:val="0"/>
                 <w:sz w:val="18"/>
                 <w:szCs w:val="18"/>
               </w:rPr>
@@ -1412,140 +908,10 @@
                 <w:szCs w:val="18"/>
               </w:rPr>
             </w:pPr>
-            <w:r>
-              <w:rPr>
-                <w:rFonts w:ascii="Century Gothic" w:hAnsi="Century Gothic"/>
-                <w:sz w:val="18"/>
-                <w:szCs w:val="18"/>
-              </w:rPr>
-              <w:drawing>
-                <wp:anchor distT="0" distB="0" distL="114300" distR="114300" simplePos="0" relativeHeight="251670528" behindDoc="1" locked="0" layoutInCell="1" allowOverlap="1" wp14:anchorId="4100772C" wp14:editId="3C39D826">
-                  <wp:simplePos x="0" y="0"/>
-                  <wp:positionH relativeFrom="column">
-                    <wp:posOffset>80645</wp:posOffset>
-                  </wp:positionH>
-                  <wp:positionV relativeFrom="paragraph">
-                    <wp:posOffset>1386840</wp:posOffset>
-                  </wp:positionV>
-                  <wp:extent cx="3051810" cy="1301750"/>
-                  <wp:effectExtent l="0" t="0" r="0" b="0"/>
-                  <wp:wrapNone/>
-                  <wp:docPr id="15" name="Picture 15"/>
-                  <wp:cNvGraphicFramePr>
-                    <a:graphicFrameLocks xmlns:a="http://schemas.openxmlformats.org/drawingml/2006/main" noChangeAspect="1"/>
-                  </wp:cNvGraphicFramePr>
-                  <a:graphic xmlns:a="http://schemas.openxmlformats.org/drawingml/2006/main">
-                    <a:graphicData uri="http://schemas.openxmlformats.org/drawingml/2006/picture">
-                      <pic:pic xmlns:pic="http://schemas.openxmlformats.org/drawingml/2006/picture">
-                        <pic:nvPicPr>
-                          <pic:cNvPr id="15" name="Picture 15"/>
-                          <pic:cNvPicPr/>
-                        </pic:nvPicPr>
-                        <pic:blipFill>
-                          <a:blip r:embed="rId11" cstate="print">
-                            <a:extLst>
-                              <a:ext uri="{28A0092B-C50C-407E-A947-70E740481C1C}">
-                                <a14:useLocalDpi xmlns:a14="http://schemas.microsoft.com/office/drawing/2010/main" val="0"/>
-                              </a:ext>
-                            </a:extLst>
-                          </a:blip>
-                          <a:stretch>
-                            <a:fillRect/>
-                          </a:stretch>
-                        </pic:blipFill>
-                        <pic:spPr>
-                          <a:xfrm>
-                            <a:off x="0" y="0"/>
-                            <a:ext cx="3051810" cy="1301750"/>
-                          </a:xfrm>
-                          <a:prstGeom prst="rect">
-                            <a:avLst/>
-                          </a:prstGeom>
-                        </pic:spPr>
-                      </pic:pic>
-                    </a:graphicData>
-                  </a:graphic>
-                  <wp14:sizeRelH relativeFrom="page">
-                    <wp14:pctWidth>0</wp14:pctWidth>
-                  </wp14:sizeRelH>
-                  <wp14:sizeRelV relativeFrom="page">
-                    <wp14:pctHeight>0</wp14:pctHeight>
-                  </wp14:sizeRelV>
-                </wp:anchor>
-              </w:drawing>
-            </w:r>
-            <w:r>
-              <w:rPr>
-                <w:rFonts w:ascii="Century Gothic" w:hAnsi="Century Gothic"/>
-                <w:sz w:val="18"/>
-                <w:szCs w:val="18"/>
-              </w:rPr>
-              <w:drawing>
-                <wp:anchor distT="0" distB="0" distL="114300" distR="114300" simplePos="0" relativeHeight="251668480" behindDoc="1" locked="0" layoutInCell="1" allowOverlap="1" wp14:anchorId="33D4F267" wp14:editId="3ECB3E03">
-                  <wp:simplePos x="0" y="0"/>
-                  <wp:positionH relativeFrom="column">
-                    <wp:posOffset>80645</wp:posOffset>
-                  </wp:positionH>
-                  <wp:positionV relativeFrom="paragraph">
-                    <wp:posOffset>-3810</wp:posOffset>
-                  </wp:positionV>
-                  <wp:extent cx="3051810" cy="1301750"/>
-                  <wp:effectExtent l="0" t="0" r="0" b="0"/>
-                  <wp:wrapNone/>
-                  <wp:docPr id="14" name="Picture 14"/>
-                  <wp:cNvGraphicFramePr>
-                    <a:graphicFrameLocks xmlns:a="http://schemas.openxmlformats.org/drawingml/2006/main" noChangeAspect="1"/>
-                  </wp:cNvGraphicFramePr>
-                  <a:graphic xmlns:a="http://schemas.openxmlformats.org/drawingml/2006/main">
-                    <a:graphicData uri="http://schemas.openxmlformats.org/drawingml/2006/picture">
-                      <pic:pic xmlns:pic="http://schemas.openxmlformats.org/drawingml/2006/picture">
-                        <pic:nvPicPr>
-                          <pic:cNvPr id="14" name="Picture 14"/>
-                          <pic:cNvPicPr/>
-                        </pic:nvPicPr>
-                        <pic:blipFill>
-                          <a:blip r:embed="rId12" cstate="print">
-                            <a:extLst>
-                              <a:ext uri="{28A0092B-C50C-407E-A947-70E740481C1C}">
-                                <a14:useLocalDpi xmlns:a14="http://schemas.microsoft.com/office/drawing/2010/main" val="0"/>
-                              </a:ext>
-                            </a:extLst>
-                          </a:blip>
-                          <a:stretch>
-                            <a:fillRect/>
-                          </a:stretch>
-                        </pic:blipFill>
-                        <pic:spPr>
-                          <a:xfrm>
-                            <a:off x="0" y="0"/>
-                            <a:ext cx="3051810" cy="1301750"/>
-                          </a:xfrm>
-                          <a:prstGeom prst="rect">
-                            <a:avLst/>
-                          </a:prstGeom>
-                        </pic:spPr>
-                      </pic:pic>
-                    </a:graphicData>
-                  </a:graphic>
-                  <wp14:sizeRelH relativeFrom="page">
-                    <wp14:pctWidth>0</wp14:pctWidth>
-                  </wp14:sizeRelH>
-                  <wp14:sizeRelV relativeFrom="page">
-                    <wp14:pctHeight>0</wp14:pctHeight>
-                  </wp14:sizeRelV>
-                </wp:anchor>
-              </w:drawing>
-            </w:r>
           </w:p>
         </w:tc>
       </w:tr>
       <w:tr>
-        <w:tblPrEx>
-          <w:tblCellMar>
-            <w:top w:w="0" w:type="dxa"/>
-            <w:bottom w:w="0" w:type="dxa"/>
-          </w:tblCellMar>
-        </w:tblPrEx>
         <w:trPr>
           <w:trHeight w:val="6011"/>
         </w:trPr>
@@ -1589,15 +955,7 @@
                 <w:sz w:val="18"/>
                 <w:szCs w:val="18"/>
               </w:rPr>
-              <w:t>Provides monitoring and supervision tools, such as dashboards, real-time status updates, notifications, and perf</w:t>
-            </w:r>
-            <w:r>
-              <w:rPr>
-                <w:rFonts w:ascii="Century Gothic" w:eastAsia="Calibri" w:hAnsi="Century Gothic" w:cs="Calibri"/>
-                <w:sz w:val="18"/>
-                <w:szCs w:val="18"/>
-              </w:rPr>
-              <w:t>ormance tracking.</w:t>
+              <w:t>Provides monitoring and supervision tools, such as dashboards, real-time status updates, notifications, and performance tracking.</w:t>
             </w:r>
           </w:p>
         </w:tc>
@@ -1617,18 +975,10 @@
             <w:r>
               <w:rPr>
                 <w:rFonts w:ascii="Century Gothic" w:eastAsia="Calibri" w:hAnsi="Century Gothic" w:cs="Calibri"/>
-                <w:b w:val="0"/>
-                <w:sz w:val="18"/>
-                <w:szCs w:val="18"/>
-              </w:rPr>
-              <w:t>Role dashboards are data-backed (student hours/progress; supervisor/faculty recent activity and quick actions; coordinator monitoring; director analytics on the dashboard). In-app notification bell with mark-read APIs is active. Performance tracking is available through evaluations, hours, and progress views.</w:t>
-            </w:r>
-            <w:r>
-              <w:rPr>
-                <w:rFonts w:ascii="Century Gothic" w:eastAsia="Calibri" w:hAnsi="Century Gothic" w:cs="Calibri"/>
-                <w:sz w:val="18"/>
-                <w:szCs w:val="18"/>
-              </w:rPr>
+                <w:sz w:val="18"/>
+                <w:szCs w:val="18"/>
+              </w:rPr>
+              <w:t>Role dashboards are data-backed (student hours/progress; supervisor/faculty recent activity and quick actions; coordinator monitoring; director analytics on the dashboard). In-app notification bell with mark-read APIs is active. Performance tracking is available through evaluations, hours, and progress views. Latest system verification/regression checkup reconfirmed live role dashboards, notifications, and monitoring tools on the develop branch.</w:t>
             </w:r>
           </w:p>
         </w:tc>
@@ -1675,11 +1025,10 @@
             <w:r>
               <w:rPr>
                 <w:rFonts w:ascii="Century Gothic" w:eastAsia="Calibri" w:hAnsi="Century Gothic" w:cs="Calibri"/>
-                <w:b w:val="0"/>
-                <w:sz w:val="18"/>
-                <w:szCs w:val="18"/>
-              </w:rPr>
-              <w:t>Live dashboards and notifications work via Sanctum APIs. Optional enhancements: email/push channels and stronger automated at-risk student flagging rules.</w:t>
+                <w:sz w:val="18"/>
+                <w:szCs w:val="18"/>
+              </w:rPr>
+              <w:t>Live dashboards and notifications work via Sanctum APIs. Optional enhancements: email/push channels and stronger automated at-risk student flagging rules. Verification checkup: monitoring/dashboard features validated; no critical defects found.</w:t>
             </w:r>
           </w:p>
         </w:tc>
@@ -1697,140 +1046,10 @@
                 <w:szCs w:val="18"/>
               </w:rPr>
             </w:pPr>
-            <w:r>
-              <w:rPr>
-                <w:rFonts w:ascii="Century Gothic" w:hAnsi="Century Gothic"/>
-                <w:sz w:val="18"/>
-                <w:szCs w:val="18"/>
-              </w:rPr>
-              <w:drawing>
-                <wp:anchor distT="0" distB="0" distL="114300" distR="114300" simplePos="0" relativeHeight="251674624" behindDoc="1" locked="0" layoutInCell="1" allowOverlap="1" wp14:anchorId="74C47F13" wp14:editId="2C0C0526">
-                  <wp:simplePos x="0" y="0"/>
-                  <wp:positionH relativeFrom="column">
-                    <wp:posOffset>80645</wp:posOffset>
-                  </wp:positionH>
-                  <wp:positionV relativeFrom="paragraph">
-                    <wp:posOffset>815975</wp:posOffset>
-                  </wp:positionV>
-                  <wp:extent cx="3051810" cy="1301750"/>
-                  <wp:effectExtent l="0" t="0" r="0" b="0"/>
-                  <wp:wrapNone/>
-                  <wp:docPr id="17" name="Picture 17"/>
-                  <wp:cNvGraphicFramePr>
-                    <a:graphicFrameLocks xmlns:a="http://schemas.openxmlformats.org/drawingml/2006/main" noChangeAspect="1"/>
-                  </wp:cNvGraphicFramePr>
-                  <a:graphic xmlns:a="http://schemas.openxmlformats.org/drawingml/2006/main">
-                    <a:graphicData uri="http://schemas.openxmlformats.org/drawingml/2006/picture">
-                      <pic:pic xmlns:pic="http://schemas.openxmlformats.org/drawingml/2006/picture">
-                        <pic:nvPicPr>
-                          <pic:cNvPr id="17" name="Picture 17"/>
-                          <pic:cNvPicPr/>
-                        </pic:nvPicPr>
-                        <pic:blipFill>
-                          <a:blip r:embed="rId13" cstate="print">
-                            <a:extLst>
-                              <a:ext uri="{28A0092B-C50C-407E-A947-70E740481C1C}">
-                                <a14:useLocalDpi xmlns:a14="http://schemas.microsoft.com/office/drawing/2010/main" val="0"/>
-                              </a:ext>
-                            </a:extLst>
-                          </a:blip>
-                          <a:stretch>
-                            <a:fillRect/>
-                          </a:stretch>
-                        </pic:blipFill>
-                        <pic:spPr>
-                          <a:xfrm>
-                            <a:off x="0" y="0"/>
-                            <a:ext cx="3051810" cy="1301750"/>
-                          </a:xfrm>
-                          <a:prstGeom prst="rect">
-                            <a:avLst/>
-                          </a:prstGeom>
-                        </pic:spPr>
-                      </pic:pic>
-                    </a:graphicData>
-                  </a:graphic>
-                  <wp14:sizeRelH relativeFrom="page">
-                    <wp14:pctWidth>0</wp14:pctWidth>
-                  </wp14:sizeRelH>
-                  <wp14:sizeRelV relativeFrom="page">
-                    <wp14:pctHeight>0</wp14:pctHeight>
-                  </wp14:sizeRelV>
-                </wp:anchor>
-              </w:drawing>
-            </w:r>
-            <w:r>
-              <w:rPr>
-                <w:rFonts w:ascii="Century Gothic" w:hAnsi="Century Gothic"/>
-                <w:sz w:val="18"/>
-                <w:szCs w:val="18"/>
-              </w:rPr>
-              <w:drawing>
-                <wp:anchor distT="0" distB="0" distL="114300" distR="114300" simplePos="0" relativeHeight="251672576" behindDoc="1" locked="0" layoutInCell="1" allowOverlap="1" wp14:anchorId="16073D7B" wp14:editId="5CD490E8">
-                  <wp:simplePos x="0" y="0"/>
-                  <wp:positionH relativeFrom="column">
-                    <wp:posOffset>86360</wp:posOffset>
-                  </wp:positionH>
-                  <wp:positionV relativeFrom="paragraph">
-                    <wp:posOffset>-563245</wp:posOffset>
-                  </wp:positionV>
-                  <wp:extent cx="3046095" cy="1301750"/>
-                  <wp:effectExtent l="0" t="0" r="1905" b="0"/>
-                  <wp:wrapNone/>
-                  <wp:docPr id="16" name="Picture 16"/>
-                  <wp:cNvGraphicFramePr>
-                    <a:graphicFrameLocks xmlns:a="http://schemas.openxmlformats.org/drawingml/2006/main" noChangeAspect="1"/>
-                  </wp:cNvGraphicFramePr>
-                  <a:graphic xmlns:a="http://schemas.openxmlformats.org/drawingml/2006/main">
-                    <a:graphicData uri="http://schemas.openxmlformats.org/drawingml/2006/picture">
-                      <pic:pic xmlns:pic="http://schemas.openxmlformats.org/drawingml/2006/picture">
-                        <pic:nvPicPr>
-                          <pic:cNvPr id="16" name="Picture 16"/>
-                          <pic:cNvPicPr/>
-                        </pic:nvPicPr>
-                        <pic:blipFill>
-                          <a:blip r:embed="rId14" cstate="print">
-                            <a:extLst>
-                              <a:ext uri="{28A0092B-C50C-407E-A947-70E740481C1C}">
-                                <a14:useLocalDpi xmlns:a14="http://schemas.microsoft.com/office/drawing/2010/main" val="0"/>
-                              </a:ext>
-                            </a:extLst>
-                          </a:blip>
-                          <a:stretch>
-                            <a:fillRect/>
-                          </a:stretch>
-                        </pic:blipFill>
-                        <pic:spPr>
-                          <a:xfrm>
-                            <a:off x="0" y="0"/>
-                            <a:ext cx="3046095" cy="1301750"/>
-                          </a:xfrm>
-                          <a:prstGeom prst="rect">
-                            <a:avLst/>
-                          </a:prstGeom>
-                        </pic:spPr>
-                      </pic:pic>
-                    </a:graphicData>
-                  </a:graphic>
-                  <wp14:sizeRelH relativeFrom="page">
-                    <wp14:pctWidth>0</wp14:pctWidth>
-                  </wp14:sizeRelH>
-                  <wp14:sizeRelV relativeFrom="page">
-                    <wp14:pctHeight>0</wp14:pctHeight>
-                  </wp14:sizeRelV>
-                </wp:anchor>
-              </w:drawing>
-            </w:r>
           </w:p>
         </w:tc>
       </w:tr>
       <w:tr>
-        <w:tblPrEx>
-          <w:tblCellMar>
-            <w:top w:w="0" w:type="dxa"/>
-            <w:bottom w:w="0" w:type="dxa"/>
-          </w:tblCellMar>
-        </w:tblPrEx>
         <w:trPr>
           <w:trHeight w:val="5174"/>
         </w:trPr>
@@ -1895,18 +1114,10 @@
             <w:r>
               <w:rPr>
                 <w:rFonts w:ascii="Century Gothic" w:eastAsia="Calibri" w:hAnsi="Century Gothic" w:cs="Calibri"/>
-                <w:b w:val="0"/>
                 <w:sz w:val="18"/>
                 <w:szCs w:val="18"/>
               </w:rPr>
               <w:t>Announcements CRUD for coordinators is implemented and visible to relevant roles. In-app notifications deliver approval/rejection and activity alerts. Feedback and coordination occur through document remarks, evaluation submissions, and role-specific monitoring/communication screens wired to the backend.</w:t>
-            </w:r>
-            <w:r>
-              <w:rPr>
-                <w:rFonts w:ascii="Century Gothic" w:eastAsia="Calibri" w:hAnsi="Century Gothic" w:cs="Calibri"/>
-                <w:sz w:val="18"/>
-                <w:szCs w:val="18"/>
-              </w:rPr>
             </w:r>
           </w:p>
         </w:tc>
@@ -1953,7 +1164,6 @@
             <w:r>
               <w:rPr>
                 <w:rFonts w:ascii="Century Gothic" w:eastAsia="Calibri" w:hAnsi="Century Gothic" w:cs="Calibri"/>
-                <w:b w:val="0"/>
                 <w:sz w:val="18"/>
                 <w:szCs w:val="18"/>
               </w:rPr>
@@ -1975,140 +1185,10 @@
                 <w:szCs w:val="18"/>
               </w:rPr>
             </w:pPr>
-            <w:r>
-              <w:rPr>
-                <w:rFonts w:ascii="Century Gothic" w:hAnsi="Century Gothic"/>
-                <w:sz w:val="18"/>
-                <w:szCs w:val="18"/>
-              </w:rPr>
-              <w:drawing>
-                <wp:anchor distT="0" distB="0" distL="114300" distR="114300" simplePos="0" relativeHeight="251678720" behindDoc="1" locked="0" layoutInCell="1" allowOverlap="1" wp14:anchorId="708FB2BE" wp14:editId="65DA7C6F">
-                  <wp:simplePos x="0" y="0"/>
-                  <wp:positionH relativeFrom="column">
-                    <wp:posOffset>98425</wp:posOffset>
-                  </wp:positionH>
-                  <wp:positionV relativeFrom="paragraph">
-                    <wp:posOffset>1177290</wp:posOffset>
-                  </wp:positionV>
-                  <wp:extent cx="3070860" cy="1301750"/>
-                  <wp:effectExtent l="0" t="0" r="0" b="0"/>
-                  <wp:wrapNone/>
-                  <wp:docPr id="19" name="Picture 19"/>
-                  <wp:cNvGraphicFramePr>
-                    <a:graphicFrameLocks xmlns:a="http://schemas.openxmlformats.org/drawingml/2006/main" noChangeAspect="1"/>
-                  </wp:cNvGraphicFramePr>
-                  <a:graphic xmlns:a="http://schemas.openxmlformats.org/drawingml/2006/main">
-                    <a:graphicData uri="http://schemas.openxmlformats.org/drawingml/2006/picture">
-                      <pic:pic xmlns:pic="http://schemas.openxmlformats.org/drawingml/2006/picture">
-                        <pic:nvPicPr>
-                          <pic:cNvPr id="19" name="Picture 19"/>
-                          <pic:cNvPicPr/>
-                        </pic:nvPicPr>
-                        <pic:blipFill>
-                          <a:blip r:embed="rId15" cstate="print">
-                            <a:extLst>
-                              <a:ext uri="{28A0092B-C50C-407E-A947-70E740481C1C}">
-                                <a14:useLocalDpi xmlns:a14="http://schemas.microsoft.com/office/drawing/2010/main" val="0"/>
-                              </a:ext>
-                            </a:extLst>
-                          </a:blip>
-                          <a:stretch>
-                            <a:fillRect/>
-                          </a:stretch>
-                        </pic:blipFill>
-                        <pic:spPr>
-                          <a:xfrm>
-                            <a:off x="0" y="0"/>
-                            <a:ext cx="3070860" cy="1301750"/>
-                          </a:xfrm>
-                          <a:prstGeom prst="rect">
-                            <a:avLst/>
-                          </a:prstGeom>
-                        </pic:spPr>
-                      </pic:pic>
-                    </a:graphicData>
-                  </a:graphic>
-                  <wp14:sizeRelH relativeFrom="page">
-                    <wp14:pctWidth>0</wp14:pctWidth>
-                  </wp14:sizeRelH>
-                  <wp14:sizeRelV relativeFrom="page">
-                    <wp14:pctHeight>0</wp14:pctHeight>
-                  </wp14:sizeRelV>
-                </wp:anchor>
-              </w:drawing>
-            </w:r>
-            <w:r>
-              <w:rPr>
-                <w:rFonts w:ascii="Century Gothic" w:hAnsi="Century Gothic"/>
-                <w:sz w:val="18"/>
-                <w:szCs w:val="18"/>
-              </w:rPr>
-              <w:drawing>
-                <wp:anchor distT="0" distB="0" distL="114300" distR="114300" simplePos="0" relativeHeight="251676672" behindDoc="1" locked="0" layoutInCell="1" allowOverlap="1" wp14:anchorId="3E6D03A4" wp14:editId="1BA7B6DB">
-                  <wp:simplePos x="0" y="0"/>
-                  <wp:positionH relativeFrom="column">
-                    <wp:posOffset>85725</wp:posOffset>
-                  </wp:positionH>
-                  <wp:positionV relativeFrom="paragraph">
-                    <wp:posOffset>-205105</wp:posOffset>
-                  </wp:positionV>
-                  <wp:extent cx="3077210" cy="1301750"/>
-                  <wp:effectExtent l="0" t="0" r="8890" b="0"/>
-                  <wp:wrapNone/>
-                  <wp:docPr id="18" name="Picture 18"/>
-                  <wp:cNvGraphicFramePr>
-                    <a:graphicFrameLocks xmlns:a="http://schemas.openxmlformats.org/drawingml/2006/main" noChangeAspect="1"/>
-                  </wp:cNvGraphicFramePr>
-                  <a:graphic xmlns:a="http://schemas.openxmlformats.org/drawingml/2006/main">
-                    <a:graphicData uri="http://schemas.openxmlformats.org/drawingml/2006/picture">
-                      <pic:pic xmlns:pic="http://schemas.openxmlformats.org/drawingml/2006/picture">
-                        <pic:nvPicPr>
-                          <pic:cNvPr id="18" name="Picture 18"/>
-                          <pic:cNvPicPr/>
-                        </pic:nvPicPr>
-                        <pic:blipFill>
-                          <a:blip r:embed="rId16" cstate="print">
-                            <a:extLst>
-                              <a:ext uri="{28A0092B-C50C-407E-A947-70E740481C1C}">
-                                <a14:useLocalDpi xmlns:a14="http://schemas.microsoft.com/office/drawing/2010/main" val="0"/>
-                              </a:ext>
-                            </a:extLst>
-                          </a:blip>
-                          <a:stretch>
-                            <a:fillRect/>
-                          </a:stretch>
-                        </pic:blipFill>
-                        <pic:spPr>
-                          <a:xfrm>
-                            <a:off x="0" y="0"/>
-                            <a:ext cx="3077210" cy="1301750"/>
-                          </a:xfrm>
-                          <a:prstGeom prst="rect">
-                            <a:avLst/>
-                          </a:prstGeom>
-                        </pic:spPr>
-                      </pic:pic>
-                    </a:graphicData>
-                  </a:graphic>
-                  <wp14:sizeRelH relativeFrom="page">
-                    <wp14:pctWidth>0</wp14:pctWidth>
-                  </wp14:sizeRelH>
-                  <wp14:sizeRelV relativeFrom="page">
-                    <wp14:pctHeight>0</wp14:pctHeight>
-                  </wp14:sizeRelV>
-                </wp:anchor>
-              </w:drawing>
-            </w:r>
           </w:p>
         </w:tc>
       </w:tr>
       <w:tr>
-        <w:tblPrEx>
-          <w:tblCellMar>
-            <w:top w:w="0" w:type="dxa"/>
-            <w:bottom w:w="0" w:type="dxa"/>
-          </w:tblCellMar>
-        </w:tblPrEx>
         <w:trPr>
           <w:trHeight w:val="5480"/>
         </w:trPr>
@@ -2172,18 +1252,10 @@
             <w:r>
               <w:rPr>
                 <w:rFonts w:ascii="Century Gothic" w:eastAsia="Calibri" w:hAnsi="Century Gothic" w:cs="Calibri"/>
-                <w:b w:val="0"/>
-                <w:sz w:val="18"/>
-                <w:szCs w:val="18"/>
-              </w:rPr>
-              <w:t>Supervisor and faculty evaluation modules are implemented. Coordinator reports (student summary, compliance, performance) and director reports/MOA views are available with client-side CSV export on selected tables. Student Portfolio Builder generates chapter content and appendices with A4 PDF preview/print support.</w:t>
-            </w:r>
-            <w:r>
-              <w:rPr>
-                <w:rFonts w:ascii="Century Gothic" w:eastAsia="Calibri" w:hAnsi="Century Gothic" w:cs="Calibri"/>
-                <w:sz w:val="18"/>
-                <w:szCs w:val="18"/>
-              </w:rPr>
+                <w:sz w:val="18"/>
+                <w:szCs w:val="18"/>
+              </w:rPr>
+              <w:t>Supervisor and faculty evaluation modules are implemented. Coordinator reports (student summary, compliance, performance) and director reports/MOA views are available with client-side CSV export on selected tables. Student Portfolio Builder generates chapter content and appendices with A4 PDF preview/print support. Certificate PDF generation and reporting paths were re-verified during the latest system checkup.</w:t>
             </w:r>
           </w:p>
         </w:tc>
@@ -2230,11 +1302,10 @@
             <w:r>
               <w:rPr>
                 <w:rFonts w:ascii="Century Gothic" w:eastAsia="Calibri" w:hAnsi="Century Gothic" w:cs="Calibri"/>
-                <w:b w:val="0"/>
-                <w:sz w:val="18"/>
-                <w:szCs w:val="18"/>
-              </w:rPr>
-              <w:t>Evaluations, portfolio PDF preview, and reporting UIs are functional. Remaining: fully automated completion-certificate issuance and deeper analytics (retention/deployment trends).</w:t>
+                <w:sz w:val="18"/>
+                <w:szCs w:val="18"/>
+              </w:rPr>
+              <w:t>Evaluations, portfolio PDF preview, and reporting UIs are functional. Remaining: fully automated completion-certificate issuance and deeper analytics (retention/deployment trends). Verification checkup: evaluations/reporting/certificate generation confirmed operational.</w:t>
             </w:r>
           </w:p>
         </w:tc>
@@ -2252,140 +1323,10 @@
                 <w:szCs w:val="18"/>
               </w:rPr>
             </w:pPr>
-            <w:r>
-              <w:rPr>
-                <w:rFonts w:ascii="Century Gothic" w:hAnsi="Century Gothic"/>
-                <w:sz w:val="18"/>
-                <w:szCs w:val="18"/>
-              </w:rPr>
-              <w:drawing>
-                <wp:anchor distT="0" distB="0" distL="114300" distR="114300" simplePos="0" relativeHeight="251682816" behindDoc="1" locked="0" layoutInCell="1" allowOverlap="1" wp14:anchorId="31ECEBDA" wp14:editId="04869E9D">
-                  <wp:simplePos x="0" y="0"/>
-                  <wp:positionH relativeFrom="column">
-                    <wp:posOffset>79375</wp:posOffset>
-                  </wp:positionH>
-                  <wp:positionV relativeFrom="paragraph">
-                    <wp:posOffset>855980</wp:posOffset>
-                  </wp:positionV>
-                  <wp:extent cx="3058160" cy="1301750"/>
-                  <wp:effectExtent l="0" t="0" r="8890" b="0"/>
-                  <wp:wrapNone/>
-                  <wp:docPr id="21" name="Picture 21"/>
-                  <wp:cNvGraphicFramePr>
-                    <a:graphicFrameLocks xmlns:a="http://schemas.openxmlformats.org/drawingml/2006/main" noChangeAspect="1"/>
-                  </wp:cNvGraphicFramePr>
-                  <a:graphic xmlns:a="http://schemas.openxmlformats.org/drawingml/2006/main">
-                    <a:graphicData uri="http://schemas.openxmlformats.org/drawingml/2006/picture">
-                      <pic:pic xmlns:pic="http://schemas.openxmlformats.org/drawingml/2006/picture">
-                        <pic:nvPicPr>
-                          <pic:cNvPr id="21" name="Picture 21"/>
-                          <pic:cNvPicPr/>
-                        </pic:nvPicPr>
-                        <pic:blipFill>
-                          <a:blip r:embed="rId17" cstate="print">
-                            <a:extLst>
-                              <a:ext uri="{28A0092B-C50C-407E-A947-70E740481C1C}">
-                                <a14:useLocalDpi xmlns:a14="http://schemas.microsoft.com/office/drawing/2010/main" val="0"/>
-                              </a:ext>
-                            </a:extLst>
-                          </a:blip>
-                          <a:stretch>
-                            <a:fillRect/>
-                          </a:stretch>
-                        </pic:blipFill>
-                        <pic:spPr>
-                          <a:xfrm>
-                            <a:off x="0" y="0"/>
-                            <a:ext cx="3058160" cy="1301750"/>
-                          </a:xfrm>
-                          <a:prstGeom prst="rect">
-                            <a:avLst/>
-                          </a:prstGeom>
-                        </pic:spPr>
-                      </pic:pic>
-                    </a:graphicData>
-                  </a:graphic>
-                  <wp14:sizeRelH relativeFrom="page">
-                    <wp14:pctWidth>0</wp14:pctWidth>
-                  </wp14:sizeRelH>
-                  <wp14:sizeRelV relativeFrom="page">
-                    <wp14:pctHeight>0</wp14:pctHeight>
-                  </wp14:sizeRelV>
-                </wp:anchor>
-              </w:drawing>
-            </w:r>
-            <w:r>
-              <w:rPr>
-                <w:rFonts w:ascii="Century Gothic" w:hAnsi="Century Gothic"/>
-                <w:sz w:val="18"/>
-                <w:szCs w:val="18"/>
-              </w:rPr>
-              <w:drawing>
-                <wp:anchor distT="0" distB="0" distL="114300" distR="114300" simplePos="0" relativeHeight="251680768" behindDoc="1" locked="0" layoutInCell="1" allowOverlap="1" wp14:anchorId="06BAB93E" wp14:editId="76D68C06">
-                  <wp:simplePos x="0" y="0"/>
-                  <wp:positionH relativeFrom="column">
-                    <wp:posOffset>66675</wp:posOffset>
-                  </wp:positionH>
-                  <wp:positionV relativeFrom="paragraph">
-                    <wp:posOffset>-521970</wp:posOffset>
-                  </wp:positionV>
-                  <wp:extent cx="3064510" cy="1301750"/>
-                  <wp:effectExtent l="0" t="0" r="2540" b="0"/>
-                  <wp:wrapNone/>
-                  <wp:docPr id="20" name="Picture 20"/>
-                  <wp:cNvGraphicFramePr>
-                    <a:graphicFrameLocks xmlns:a="http://schemas.openxmlformats.org/drawingml/2006/main" noChangeAspect="1"/>
-                  </wp:cNvGraphicFramePr>
-                  <a:graphic xmlns:a="http://schemas.openxmlformats.org/drawingml/2006/main">
-                    <a:graphicData uri="http://schemas.openxmlformats.org/drawingml/2006/picture">
-                      <pic:pic xmlns:pic="http://schemas.openxmlformats.org/drawingml/2006/picture">
-                        <pic:nvPicPr>
-                          <pic:cNvPr id="20" name="Picture 20"/>
-                          <pic:cNvPicPr/>
-                        </pic:nvPicPr>
-                        <pic:blipFill>
-                          <a:blip r:embed="rId18" cstate="print">
-                            <a:extLst>
-                              <a:ext uri="{28A0092B-C50C-407E-A947-70E740481C1C}">
-                                <a14:useLocalDpi xmlns:a14="http://schemas.microsoft.com/office/drawing/2010/main" val="0"/>
-                              </a:ext>
-                            </a:extLst>
-                          </a:blip>
-                          <a:stretch>
-                            <a:fillRect/>
-                          </a:stretch>
-                        </pic:blipFill>
-                        <pic:spPr>
-                          <a:xfrm>
-                            <a:off x="0" y="0"/>
-                            <a:ext cx="3064510" cy="1301750"/>
-                          </a:xfrm>
-                          <a:prstGeom prst="rect">
-                            <a:avLst/>
-                          </a:prstGeom>
-                        </pic:spPr>
-                      </pic:pic>
-                    </a:graphicData>
-                  </a:graphic>
-                  <wp14:sizeRelH relativeFrom="page">
-                    <wp14:pctWidth>0</wp14:pctWidth>
-                  </wp14:sizeRelH>
-                  <wp14:sizeRelV relativeFrom="page">
-                    <wp14:pctHeight>0</wp14:pctHeight>
-                  </wp14:sizeRelV>
-                </wp:anchor>
-              </w:drawing>
-            </w:r>
           </w:p>
         </w:tc>
       </w:tr>
       <w:tr>
-        <w:tblPrEx>
-          <w:tblCellMar>
-            <w:top w:w="0" w:type="dxa"/>
-            <w:bottom w:w="0" w:type="dxa"/>
-          </w:tblCellMar>
-        </w:tblPrEx>
         <w:tc>
           <w:tcPr>
             <w:tcW w:w="2169" w:type="dxa"/>
@@ -2447,18 +1388,10 @@
             <w:r>
               <w:rPr>
                 <w:rFonts w:ascii="Century Gothic" w:eastAsia="Calibri" w:hAnsi="Century Gothic" w:cs="Calibri"/>
-                <w:b w:val="0"/>
                 <w:sz w:val="18"/>
                 <w:szCs w:val="18"/>
               </w:rPr>
               <w:t>MISD coordination is partially implemented: login auto-provisions users through MisdIntegrationService; mock MISD endpoints support local development. Student/faculty profile fields are sourced from provisioned institutional data where available.</w:t>
-            </w:r>
-            <w:r>
-              <w:rPr>
-                <w:rFonts w:ascii="Century Gothic" w:eastAsia="Calibri" w:hAnsi="Century Gothic" w:cs="Calibri"/>
-                <w:sz w:val="18"/>
-                <w:szCs w:val="18"/>
-              </w:rPr>
             </w:r>
           </w:p>
         </w:tc>
@@ -2505,7 +1438,6 @@
             <w:r>
               <w:rPr>
                 <w:rFonts w:ascii="Century Gothic" w:eastAsia="Calibri" w:hAnsi="Century Gothic" w:cs="Calibri"/>
-                <w:b w:val="0"/>
                 <w:sz w:val="18"/>
                 <w:szCs w:val="18"/>
               </w:rPr>
@@ -2564,12 +1496,6 @@
         </w:tc>
       </w:tr>
       <w:tr>
-        <w:tblPrEx>
-          <w:tblCellMar>
-            <w:top w:w="0" w:type="dxa"/>
-            <w:bottom w:w="0" w:type="dxa"/>
-          </w:tblCellMar>
-        </w:tblPrEx>
         <w:tc>
           <w:tcPr>
             <w:tcW w:w="2169" w:type="dxa"/>
@@ -2610,15 +1536,7 @@
                 <w:sz w:val="18"/>
                 <w:szCs w:val="18"/>
               </w:rPr>
-              <w:t>Evaluate the acceptability of the system based on selected ISO/IEC 25010 software quality characteristics</w:t>
-            </w:r>
-            <w:r>
-              <w:rPr>
-                <w:rFonts w:ascii="Century Gothic" w:eastAsia="Calibri" w:hAnsi="Century Gothic" w:cs="Calibri"/>
-                <w:sz w:val="18"/>
-                <w:szCs w:val="18"/>
-              </w:rPr>
-              <w:t xml:space="preserve"> through end-user assessment (functional suitability, usability, performance efficiency, reliability) and IT expert assessment (functional suitability, reliability, performance efficiency, security).</w:t>
+              <w:t>Evaluate the acceptability of the system based on selected ISO/IEC 25010 software quality characteristics through end-user assessment (functional suitability, usability, performance efficiency, reliability) and IT expert assessment (functional suitability, reliability, performance efficiency, security).</w:t>
             </w:r>
           </w:p>
         </w:tc>
@@ -2638,18 +1556,10 @@
             <w:r>
               <w:rPr>
                 <w:rFonts w:ascii="Century Gothic" w:eastAsia="Calibri" w:hAnsi="Century Gothic" w:cs="Calibri"/>
-                <w:b w:val="0"/>
-                <w:sz w:val="18"/>
-                <w:szCs w:val="18"/>
-              </w:rPr>
-              <w:t>The system has moved beyond prototype into a working multi-role web application with authenticated APIs and persistent data. Informal internal testing of core workflows is ongoing. Formal ISO/IEC 25010 end-user and IT-expert evaluation instruments are prepared for administration once final UAT packaging is complete.</w:t>
-            </w:r>
-            <w:r>
-              <w:rPr>
-                <w:rFonts w:ascii="Century Gothic" w:eastAsia="Calibri" w:hAnsi="Century Gothic" w:cs="Calibri"/>
-                <w:sz w:val="18"/>
-                <w:szCs w:val="18"/>
-              </w:rPr>
+                <w:sz w:val="18"/>
+                <w:szCs w:val="18"/>
+              </w:rPr>
+              <w:t>Survey questionnaires aligned with selected ISO/IEC 25010 software quality characteristics have been completed and presented to the research professor. The instruments were generally accepted, with only minor structural and presentation revisions recommended prior to administration. Latest system verification/regression checkup confirmed core modules are stable for upcoming formal acceptability evaluation. Formal end-user and IT-expert administration and analysis remain pending.</w:t>
             </w:r>
           </w:p>
         </w:tc>
@@ -2676,7 +1586,7 @@
                 <w:sz w:val="18"/>
                 <w:szCs w:val="18"/>
               </w:rPr>
-              <w:t>25%</w:t>
+              <w:t>70%</w:t>
             </w:r>
           </w:p>
         </w:tc>
@@ -2696,11 +1606,10 @@
             <w:r>
               <w:rPr>
                 <w:rFonts w:ascii="Century Gothic" w:eastAsia="Calibri" w:hAnsi="Century Gothic" w:cs="Calibri"/>
-                <w:b w:val="0"/>
-                <w:sz w:val="18"/>
-                <w:szCs w:val="18"/>
-              </w:rPr>
-              <w:t>Ready to schedule formal acceptability testing. Instruments not yet fully administered or analyzed.</w:t>
+                <w:sz w:val="18"/>
+                <w:szCs w:val="18"/>
+              </w:rPr>
+              <w:t>Objective 2 &amp; 3 instruments are complete and professor-reviewed (minor revisions only). Not yet administered to respondents; analysis pending. Consistency with ISO/IEC 25010 characteristics for end users and IT experts is maintained.</w:t>
             </w:r>
           </w:p>
         </w:tc>
@@ -2754,6 +1663,154 @@
           </w:p>
         </w:tc>
       </w:tr>
+      <w:tr>
+        <w:tc>
+          <w:tcPr>
+            <w:tcW w:w="2169" w:type="dxa"/>
+            <w:shd w:val="clear" w:color="auto" w:fill="DCE6F1"/>
+          </w:tcPr>
+          <w:p>
+            <w:pPr>
+              <w:spacing w:before="80" w:after="40"/>
+              <w:rPr>
+                <w:rFonts w:ascii="Century Gothic" w:hAnsi="Century Gothic"/>
+                <w:sz w:val="18"/>
+                <w:szCs w:val="18"/>
+              </w:rPr>
+            </w:pPr>
+            <w:r>
+              <w:rPr>
+                <w:rFonts w:ascii="Century Gothic" w:eastAsia="Calibri" w:hAnsi="Century Gothic" w:cs="Calibri"/>
+                <w:b/>
+                <w:bCs/>
+                <w:sz w:val="18"/>
+                <w:szCs w:val="18"/>
+              </w:rPr>
+              <w:t>Total Average</w:t>
+            </w:r>
+          </w:p>
+        </w:tc>
+        <w:tc>
+          <w:tcPr>
+            <w:tcW w:w="2126" w:type="dxa"/>
+          </w:tcPr>
+          <w:p>
+            <w:pPr>
+              <w:spacing w:before="80" w:after="80"/>
+              <w:rPr>
+                <w:rFonts w:ascii="Century Gothic" w:hAnsi="Century Gothic"/>
+                <w:sz w:val="18"/>
+                <w:szCs w:val="18"/>
+              </w:rPr>
+            </w:pPr>
+            <w:r>
+              <w:rPr>
+                <w:rFonts w:ascii="Century Gothic" w:eastAsia="Calibri" w:hAnsi="Century Gothic" w:cs="Calibri"/>
+                <w:sz w:val="18"/>
+                <w:szCs w:val="18"/>
+              </w:rPr>
+              <w:t>Mean of all 8 objective/scope percentage cells listed above.</w:t>
+            </w:r>
+          </w:p>
+        </w:tc>
+        <w:tc>
+          <w:tcPr>
+            <w:tcW w:w="875" w:type="dxa"/>
+            <w:vAlign w:val="center"/>
+          </w:tcPr>
+          <w:p>
+            <w:pPr>
+              <w:jc w:val="center"/>
+              <w:rPr>
+                <w:rFonts w:ascii="Century Gothic" w:hAnsi="Century Gothic"/>
+                <w:sz w:val="18"/>
+                <w:szCs w:val="18"/>
+              </w:rPr>
+            </w:pPr>
+            <w:r>
+              <w:rPr>
+                <w:rFonts w:ascii="Century Gothic" w:eastAsia="Calibri" w:hAnsi="Century Gothic" w:cs="Calibri"/>
+                <w:b/>
+                <w:bCs/>
+                <w:color w:val="007000"/>
+                <w:sz w:val="18"/>
+                <w:szCs w:val="18"/>
+              </w:rPr>
+              <w:t>77%</w:t>
+            </w:r>
+          </w:p>
+        </w:tc>
+        <w:tc>
+          <w:tcPr>
+            <w:tcW w:w="1245" w:type="dxa"/>
+          </w:tcPr>
+          <w:p>
+            <w:pPr>
+              <w:spacing w:before="80" w:after="80"/>
+              <w:rPr>
+                <w:rFonts w:ascii="Century Gothic" w:hAnsi="Century Gothic"/>
+                <w:sz w:val="18"/>
+                <w:szCs w:val="18"/>
+              </w:rPr>
+            </w:pPr>
+            <w:r>
+              <w:rPr>
+                <w:rFonts w:ascii="Century Gothic" w:eastAsia="Calibri" w:hAnsi="Century Gothic" w:cs="Calibri"/>
+                <w:sz w:val="18"/>
+                <w:szCs w:val="18"/>
+              </w:rPr>
+              <w:t>Overall system development progress as of July 21, 2026.</w:t>
+            </w:r>
+          </w:p>
+        </w:tc>
+        <w:tc>
+          <w:tcPr>
+            <w:tcW w:w="5195" w:type="dxa"/>
+            <w:vAlign w:val="center"/>
+          </w:tcPr>
+          <w:p>
+            <w:pPr>
+              <w:jc w:val="center"/>
+              <w:rPr>
+                <w:rFonts w:ascii="Century Gothic" w:hAnsi="Century Gothic"/>
+                <w:sz w:val="18"/>
+                <w:szCs w:val="18"/>
+              </w:rPr>
+            </w:pPr>
+            <w:r>
+              <w:rPr>
+                <w:rFonts w:ascii="Century Gothic" w:eastAsia="Calibri" w:hAnsi="Century Gothic" w:cs="Calibri"/>
+                <w:i/>
+                <w:iCs/>
+                <w:color w:val="808080"/>
+                <w:sz w:val="16"/>
+                <w:szCs w:val="16"/>
+              </w:rPr>
+              <w:t>—</w:t>
+            </w:r>
+            <w:r>
+              <w:rPr>
+                <w:rFonts w:ascii="Century Gothic" w:eastAsia="Calibri" w:hAnsi="Century Gothic" w:cs="Calibri"/>
+                <w:i/>
+                <w:iCs/>
+                <w:color w:val="808080"/>
+                <w:sz w:val="16"/>
+                <w:szCs w:val="16"/>
+              </w:rPr>
+            </w:r>
+            <w:r>
+              <w:rPr>
+                <w:rFonts w:ascii="Century Gothic" w:eastAsia="Calibri" w:hAnsi="Century Gothic" w:cs="Calibri"/>
+                <w:i/>
+                <w:iCs/>
+                <w:color w:val="808080"/>
+                <w:sz w:val="16"/>
+                <w:szCs w:val="16"/>
+              </w:rPr>
+            </w:r>
+          </w:p>
+        </w:tc>
+      </w:tr>
     </w:tbl>
     <w:p>
       <w:pPr>
@@ -2774,6 +1831,391 @@
         </w:rPr>
         <w:t>Summary of Pending Items:</w:t>
       </w:r>
+    </w:p>
+    <w:p>
+      <w:pPr>
+        <w:spacing w:before="80" w:after="60"/>
+        <w:rPr>
+          <w:rFonts w:ascii="Century Gothic" w:hAnsi="Century Gothic"/>
+          <w:sz w:val="18"/>
+          <w:szCs w:val="18"/>
+        </w:rPr>
+      </w:pPr>
+      <w:r>
+        <w:rPr>
+          <w:rFonts w:ascii="Century Gothic" w:eastAsia="Calibri" w:hAnsi="Century Gothic" w:cs="Calibri"/>
+          <w:sz w:val="18"/>
+          <w:szCs w:val="18"/>
+        </w:rPr>
+        <w:t>The following items remain unfinished as of July 21, 2026 and are targeted for completion prior to final testing and deployment:</w:t>
+      </w:r>
+    </w:p>
+    <w:p>
+      <w:pPr>
+        <w:spacing w:before="40" w:after="40"/>
+        <w:ind w:left="480" w:hanging="240"/>
+        <w:rPr>
+          <w:rFonts w:ascii="Century Gothic" w:hAnsi="Century Gothic"/>
+          <w:sz w:val="18"/>
+          <w:szCs w:val="18"/>
+        </w:rPr>
+      </w:pPr>
+      <w:r>
+        <w:rPr>
+          <w:rFonts w:ascii="Century Gothic" w:eastAsia="Calibri" w:hAnsi="Century Gothic" w:cs="Calibri"/>
+          <w:sz w:val="18"/>
+          <w:szCs w:val="18"/>
+        </w:rPr>
+        <w:t>1. Formal ISO/IEC 25010 Evaluation — Survey questionnaires have been completed and generally accepted by the research professor, with only minor structural/presentation revisions recommended; end-user and IT-expert administration and analysis remain pending.</w:t>
+      </w:r>
+    </w:p>
+    <w:p>
+      <w:pPr>
+        <w:spacing w:before="40" w:after="40"/>
+        <w:ind w:left="480" w:hanging="240"/>
+        <w:rPr>
+          <w:rFonts w:ascii="Century Gothic" w:hAnsi="Century Gothic"/>
+          <w:sz w:val="18"/>
+          <w:szCs w:val="18"/>
+        </w:rPr>
+      </w:pPr>
+      <w:r>
+        <w:rPr>
+          <w:rFonts w:ascii="Century Gothic" w:eastAsia="Calibri" w:hAnsi="Century Gothic" w:cs="Calibri"/>
+          <w:sz w:val="18"/>
+          <w:szCs w:val="18"/>
+        </w:rPr>
+        <w:t>2. Full Production MISD Sync — Finalize institutional MISD contracts beyond current auto-provision/mock integration.</w:t>
+      </w:r>
+    </w:p>
+    <w:p>
+      <w:pPr>
+        <w:spacing w:before="40" w:after="40"/>
+        <w:ind w:left="480" w:hanging="240"/>
+        <w:rPr>
+          <w:rFonts w:ascii="Century Gothic" w:hAnsi="Century Gothic"/>
+          <w:sz w:val="18"/>
+          <w:szCs w:val="18"/>
+        </w:rPr>
+      </w:pPr>
+      <w:r>
+        <w:rPr>
+          <w:rFonts w:ascii="Century Gothic" w:eastAsia="Calibri" w:hAnsi="Century Gothic" w:cs="Calibri"/>
+          <w:sz w:val="18"/>
+          <w:szCs w:val="18"/>
+        </w:rPr>
+        <w:t>3. Advanced Compliance Automation — Stronger document-vs-hours discrepancy detection and at-risk escalation rules.</w:t>
+      </w:r>
+    </w:p>
+    <w:p>
+      <w:pPr>
+        <w:spacing w:before="40" w:after="40"/>
+        <w:ind w:left="480" w:hanging="240"/>
+        <w:rPr>
+          <w:rFonts w:ascii="Century Gothic" w:hAnsi="Century Gothic"/>
+          <w:sz w:val="18"/>
+          <w:szCs w:val="18"/>
+        </w:rPr>
+      </w:pPr>
+      <w:r>
+        <w:rPr>
+          <w:rFonts w:ascii="Century Gothic" w:eastAsia="Calibri" w:hAnsi="Century Gothic" w:cs="Calibri"/>
+          <w:sz w:val="18"/>
+          <w:szCs w:val="18"/>
+        </w:rPr>
+        <w:lastRenderedPageBreak/>
+        <w:t>4. Certificate Automation — Fully automatic completion-certificate issuance and consolidated score workflows.</w:t>
+      </w:r>
+    </w:p>
+    <w:p>
+      <w:pPr>
+        <w:spacing w:before="40" w:after="40"/>
+        <w:ind w:left="480" w:hanging="240"/>
+        <w:rPr>
+          <w:rFonts w:ascii="Century Gothic" w:hAnsi="Century Gothic"/>
+          <w:sz w:val="18"/>
+          <w:szCs w:val="18"/>
+        </w:rPr>
+      </w:pPr>
+      <w:r>
+        <w:rPr>
+          <w:rFonts w:ascii="Century Gothic" w:eastAsia="Calibri" w:hAnsi="Century Gothic" w:cs="Calibri"/>
+          <w:sz w:val="18"/>
+          <w:szCs w:val="18"/>
+        </w:rPr>
+        <w:t>5. Broader Analytics — Deeper deployment/retention trend analytics for Director/Coordinator reporting.</w:t>
+      </w:r>
+    </w:p>
+    <w:p>
+      <w:pPr>
+        <w:spacing w:before="40" w:after="40"/>
+        <w:ind w:left="480" w:hanging="240"/>
+        <w:rPr>
+          <w:rFonts w:ascii="Century Gothic" w:hAnsi="Century Gothic"/>
+          <w:sz w:val="18"/>
+          <w:szCs w:val="18"/>
+        </w:rPr>
+      </w:pPr>
+      <w:r>
+        <w:rPr>
+          <w:rFonts w:ascii="Century Gothic" w:eastAsia="Calibri" w:hAnsi="Century Gothic" w:cs="Calibri"/>
+          <w:sz w:val="18"/>
+          <w:szCs w:val="18"/>
+        </w:rPr>
+        <w:t>6. Final UAT Polish — Cross-role acceptance testing, edge-case hardening, and deployment packaging.</w:t>
+      </w:r>
+    </w:p>
+    <w:p>
+      <w:pPr>
+        <w:spacing w:before="40" w:after="40"/>
+        <w:ind w:left="480" w:hanging="240"/>
+        <w:rPr>
+          <w:rFonts w:ascii="Century Gothic" w:hAnsi="Century Gothic"/>
+          <w:sz w:val="18"/>
+          <w:szCs w:val="18"/>
+        </w:rPr>
+      </w:pPr>
+    </w:p>
+    <w:p>
+      <w:pPr>
+        <w:spacing w:before="40" w:after="40"/>
+        <w:ind w:left="480" w:hanging="240"/>
+        <w:rPr>
+          <w:rFonts w:ascii="Century Gothic" w:hAnsi="Century Gothic"/>
+          <w:sz w:val="18"/>
+          <w:szCs w:val="18"/>
+        </w:rPr>
+      </w:pPr>
+      <w:r>
+        <w:rPr>
+          <w:b/>
+        </w:rPr>
+        <w:t>Survey Questionnaire Progress</w:t>
+      </w:r>
+    </w:p>
+    <w:p>
+      <w:pPr>
+        <w:spacing w:before="40" w:after="40"/>
+        <w:ind w:left="480" w:hanging="240"/>
+        <w:rPr>
+          <w:rFonts w:ascii="Century Gothic" w:hAnsi="Century Gothic"/>
+          <w:sz w:val="18"/>
+          <w:szCs w:val="18"/>
+        </w:rPr>
+      </w:pPr>
+      <w:r>
+        <w:rPr>
+          <w:b w:val="0"/>
+        </w:rPr>
+        <w:t>The ISO/IEC 25010–aligned survey questionnaires for Specific Objectives 2 and 3 have been completed and presented to the research professor. The instruments were generally accepted, with only minor revisions and presentation improvements recommended before actual administration to end users and IT experts. Formal survey administration and analysis remain pending.</w:t>
+      </w:r>
+    </w:p>
+    <w:p>
+      <w:pPr>
+        <w:spacing w:before="40" w:after="40"/>
+        <w:ind w:left="480" w:hanging="240"/>
+        <w:rPr>
+          <w:rFonts w:ascii="Century Gothic" w:hAnsi="Century Gothic"/>
+          <w:sz w:val="18"/>
+          <w:szCs w:val="18"/>
+        </w:rPr>
+      </w:pPr>
+    </w:p>
+    <w:p>
+      <w:pPr>
+        <w:spacing w:before="40" w:after="40"/>
+        <w:ind w:left="480" w:hanging="240"/>
+        <w:rPr>
+          <w:rFonts w:ascii="Century Gothic" w:hAnsi="Century Gothic"/>
+          <w:sz w:val="18"/>
+          <w:szCs w:val="18"/>
+        </w:rPr>
+      </w:pPr>
+      <w:r>
+        <w:rPr>
+          <w:b/>
+        </w:rPr>
+        <w:t>Current System Checkup Result</w:t>
+      </w:r>
+    </w:p>
+    <w:p>
+      <w:pPr>
+        <w:spacing w:before="40" w:after="40"/>
+        <w:ind w:left="480" w:hanging="240"/>
+        <w:rPr>
+          <w:rFonts w:ascii="Century Gothic" w:hAnsi="Century Gothic"/>
+          <w:sz w:val="18"/>
+          <w:szCs w:val="18"/>
+        </w:rPr>
+      </w:pPr>
+      <w:r>
+        <w:rPr>
+          <w:b/>
+        </w:rPr>
+        <w:t>Overall System Status</w:t>
+      </w:r>
+    </w:p>
+    <w:p>
+      <w:pPr>
+        <w:spacing w:before="40" w:after="40"/>
+        <w:ind w:left="480" w:hanging="240"/>
+        <w:rPr>
+          <w:rFonts w:ascii="Century Gothic" w:hAnsi="Century Gothic"/>
+          <w:sz w:val="18"/>
+          <w:szCs w:val="18"/>
+        </w:rPr>
+      </w:pPr>
+      <w:r>
+        <w:rPr>
+          <w:b w:val="0"/>
+        </w:rPr>
+        <w:t>A comprehensive live API verification, code audit, and fresh database migration with seeding were performed on the latest develop branch. The checkup confirmed that INTERNTRACK is stable in its current state, and no critical production bugs requiring immediate code fixes were identified.</w:t>
+      </w:r>
+    </w:p>
+    <w:p>
+      <w:pPr>
+        <w:spacing w:before="40" w:after="40"/>
+        <w:ind w:left="480" w:hanging="240"/>
+        <w:rPr>
+          <w:rFonts w:ascii="Century Gothic" w:hAnsi="Century Gothic"/>
+          <w:sz w:val="18"/>
+          <w:szCs w:val="18"/>
+        </w:rPr>
+      </w:pPr>
+      <w:r>
+        <w:rPr>
+          <w:b/>
+        </w:rPr>
+        <w:t>Completed and Verified Features</w:t>
+      </w:r>
+    </w:p>
+    <w:p>
+      <w:pPr>
+        <w:spacing w:before="40" w:after="40"/>
+        <w:ind w:left="480" w:hanging="240"/>
+        <w:rPr>
+          <w:rFonts w:ascii="Century Gothic" w:hAnsi="Century Gothic"/>
+          <w:sz w:val="18"/>
+          <w:szCs w:val="18"/>
+        </w:rPr>
+      </w:pPr>
+      <w:r>
+        <w:rPr>
+          <w:b w:val="0"/>
+        </w:rPr>
+        <w:t>Core authentication and user-management capabilities were re-verified, including avatar upload synchronization across roles, shared user-context updates, the custom logout confirmation modal, Sanctum token revocation on logout, and passing authentication tests. Shared reusable components such as PageError, RoleSummaryPanel, and logout confirmation dialogs continue to function correctly across modules. Internship status management was confirmed to require a reason for status changes, to record status history, and to reflect internship status on student dashboards. Document management queues for Coordinators and Faculty correctly filter assigned records, and completion-certificate generation successfully produces downloadable PDF files. The supervisor invitation workflow—including QR-based invitations, pending/assigned/approval states, and role-based access restrictions—was verified end to end. Fresh database seeding successfully generates student accounts 2300592 and 2300600, with login and dashboard access confirmed. The system consistently uses Academic Year 2025–2026 and Semester 2, with no outdated academic-year configurations remaining. A general system audit also confirmed the absence of Lorem Ipsum or fake placeholder content, unbroken sidebar navigation, and standardized API response structures.</w:t>
+      </w:r>
+    </w:p>
+    <w:p>
+      <w:pPr>
+        <w:spacing w:before="40" w:after="40"/>
+        <w:ind w:left="480" w:hanging="240"/>
+        <w:rPr>
+          <w:rFonts w:ascii="Century Gothic" w:hAnsi="Century Gothic"/>
+          <w:sz w:val="18"/>
+          <w:szCs w:val="18"/>
+        </w:rPr>
+      </w:pPr>
+      <w:r>
+        <w:rPr>
+          <w:b/>
+        </w:rPr>
+        <w:t>Minor Future Enhancements</w:t>
+      </w:r>
+    </w:p>
+    <w:p>
+      <w:pPr>
+        <w:spacing w:before="40" w:after="40"/>
+        <w:ind w:left="480" w:hanging="240"/>
+        <w:rPr>
+          <w:rFonts w:ascii="Century Gothic" w:hAnsi="Century Gothic"/>
+          <w:sz w:val="18"/>
+          <w:szCs w:val="18"/>
+        </w:rPr>
+      </w:pPr>
+      <w:r>
+        <w:rPr>
+          <w:b w:val="0"/>
+        </w:rPr>
+        <w:t>Several minor enhancements were noted for future development iterations and do not affect current functionality or system stability. These include replacing remaining console.error catch blocks with user-friendly error handling, removing or integrating the unused StatCard component, replacing the remaining window.confirm dialog in the Portfolio Builder, finalizing the product-scope decision for the System Evaluation module, and continuing planned improvements to password validation, password confirmation, and future Two-Factor Authentication support.</w:t>
+      </w:r>
+    </w:p>
+    <w:p>
+      <w:pPr>
+        <w:spacing w:before="40" w:after="40"/>
+        <w:ind w:left="480" w:hanging="240"/>
+        <w:rPr>
+          <w:rFonts w:ascii="Century Gothic" w:hAnsi="Century Gothic"/>
+          <w:sz w:val="18"/>
+          <w:szCs w:val="18"/>
+        </w:rPr>
+      </w:pPr>
+      <w:r>
+        <w:rPr>
+          <w:b/>
+        </w:rPr>
+        <w:t>Overall Assessment</w:t>
+      </w:r>
+    </w:p>
+    <w:p>
+      <w:pPr>
+        <w:spacing w:before="40" w:after="40"/>
+        <w:ind w:left="480" w:hanging="240"/>
+        <w:rPr>
+          <w:rFonts w:ascii="Century Gothic" w:hAnsi="Century Gothic"/>
+          <w:sz w:val="18"/>
+          <w:szCs w:val="18"/>
+        </w:rPr>
+      </w:pPr>
+      <w:r>
+        <w:rPr>
+          <w:b w:val="0"/>
+        </w:rPr>
+        <w:t>Based on the latest comprehensive system checkup, INTERNTRACK is operating as expected. Core modules—including authentication, internship management, document processing, role-based access control, supervisor invitation workflow, certificate generation, and academic year configuration—have been successfully validated. The remaining items are minor refinements intended to improve maintainability and user experience as the project moves toward completion.</w:t>
+      </w:r>
+    </w:p>
+    <w:p>
+      <w:pPr>
+        <w:spacing w:before="40" w:after="40"/>
+        <w:ind w:left="480" w:hanging="240"/>
+        <w:rPr>
+          <w:rFonts w:ascii="Century Gothic" w:hAnsi="Century Gothic"/>
+          <w:sz w:val="18"/>
+          <w:szCs w:val="18"/>
+        </w:rPr>
+      </w:pPr>
+    </w:p>
+    <w:p>
+      <w:pPr>
+        <w:spacing w:before="40" w:after="40"/>
+        <w:ind w:left="480" w:hanging="240"/>
+        <w:rPr>
+          <w:rFonts w:ascii="Century Gothic" w:eastAsia="Calibri" w:hAnsi="Century Gothic" w:cs="Calibri"/>
+          <w:sz w:val="18"/>
+          <w:szCs w:val="18"/>
+        </w:rPr>
+      </w:pPr>
+    </w:p>
+    <w:p>
+      <w:pPr>
+        <w:spacing w:before="40" w:after="40"/>
+        <w:ind w:left="480" w:hanging="240"/>
+        <w:rPr>
+          <w:rFonts w:ascii="Century Gothic" w:eastAsia="Calibri" w:hAnsi="Century Gothic" w:cs="Calibri"/>
+          <w:sz w:val="18"/>
+          <w:szCs w:val="18"/>
+        </w:rPr>
+      </w:pPr>
+    </w:p>
+    <w:p>
+      <w:pPr>
+        <w:spacing w:before="300" w:after="100"/>
+        <w:rPr>
+          <w:rFonts w:ascii="Century Gothic" w:hAnsi="Century Gothic"/>
+          <w:sz w:val="18"/>
+          <w:szCs w:val="18"/>
+        </w:rPr>
+      </w:pPr>
       <w:r>
         <w:rPr>
           <w:rFonts w:ascii="Century Gothic" w:eastAsia="Calibri" w:hAnsi="Century Gothic" w:cs="Calibri"/>
@@ -2782,257 +2224,13 @@
           <w:sz w:val="22"/>
           <w:szCs w:val="22"/>
         </w:rPr>
-      </w:r>
-    </w:p>
-    <w:p>
-      <w:pPr>
-        <w:spacing w:before="80" w:after="60"/>
-        <w:rPr>
-          <w:rFonts w:ascii="Century Gothic" w:hAnsi="Century Gothic"/>
-          <w:sz w:val="18"/>
-          <w:szCs w:val="18"/>
-        </w:rPr>
-      </w:pPr>
-      <w:r>
-        <w:rPr>
-          <w:rFonts w:ascii="Century Gothic" w:eastAsia="Calibri" w:hAnsi="Century Gothic" w:cs="Calibri"/>
-          <w:sz w:val="18"/>
-          <w:szCs w:val="18"/>
-        </w:rPr>
-        <w:t>The following items remain unfinished as of July 18, 2026 and are targeted for completion prior to final testing and deployment:</w:t>
+        <w:br/>
       </w:r>
     </w:p>
     <w:p>
       <w:pPr>
         <w:spacing w:before="40" w:after="40"/>
         <w:ind w:left="480" w:hanging="240"/>
-        <w:rPr>
-          <w:rFonts w:ascii="Century Gothic" w:hAnsi="Century Gothic"/>
-          <w:sz w:val="18"/>
-          <w:szCs w:val="18"/>
-        </w:rPr>
-      </w:pPr>
-      <w:r>
-        <w:rPr>
-          <w:rFonts w:ascii="Century Gothic" w:eastAsia="Calibri" w:hAnsi="Century Gothic" w:cs="Calibri"/>
-          <w:sz w:val="18"/>
-          <w:szCs w:val="18"/>
-        </w:rPr>
-        <w:t>1. Formal ISO/IEC 25010 Evaluation — End-user and IT expert assessments still to be administered and analyzed.</w:t>
-      </w:r>
-      <w:r>
-        <w:rPr>
-          <w:rFonts w:ascii="Century Gothic" w:eastAsia="Calibri" w:hAnsi="Century Gothic" w:cs="Calibri"/>
-          <w:sz w:val="18"/>
-          <w:szCs w:val="18"/>
-        </w:rPr>
-      </w:r>
-      <w:r>
-        <w:rPr>
-          <w:rFonts w:ascii="Century Gothic" w:eastAsia="Calibri" w:hAnsi="Century Gothic" w:cs="Calibri"/>
-          <w:sz w:val="18"/>
-          <w:szCs w:val="18"/>
-        </w:rPr>
-      </w:r>
-    </w:p>
-    <w:p>
-      <w:pPr>
-        <w:spacing w:before="40" w:after="40"/>
-        <w:ind w:left="480" w:hanging="240"/>
-        <w:rPr>
-          <w:rFonts w:ascii="Century Gothic" w:hAnsi="Century Gothic"/>
-          <w:sz w:val="18"/>
-          <w:szCs w:val="18"/>
-        </w:rPr>
-      </w:pPr>
-      <w:r>
-        <w:rPr>
-          <w:rFonts w:ascii="Century Gothic" w:eastAsia="Calibri" w:hAnsi="Century Gothic" w:cs="Calibri"/>
-          <w:sz w:val="18"/>
-          <w:szCs w:val="18"/>
-        </w:rPr>
-        <w:t>2. Full Production MISD Sync — Finalize institutional MISD contracts beyond current auto-provision/mock integration.</w:t>
-      </w:r>
-      <w:r>
-        <w:rPr>
-          <w:rFonts w:ascii="Century Gothic" w:eastAsia="Calibri" w:hAnsi="Century Gothic" w:cs="Calibri"/>
-          <w:sz w:val="18"/>
-          <w:szCs w:val="18"/>
-        </w:rPr>
-      </w:r>
-    </w:p>
-    <w:p>
-      <w:pPr>
-        <w:spacing w:before="40" w:after="40"/>
-        <w:ind w:left="480" w:hanging="240"/>
-        <w:rPr>
-          <w:rFonts w:ascii="Century Gothic" w:hAnsi="Century Gothic"/>
-          <w:sz w:val="18"/>
-          <w:szCs w:val="18"/>
-        </w:rPr>
-      </w:pPr>
-      <w:r>
-        <w:rPr>
-          <w:rFonts w:ascii="Century Gothic" w:eastAsia="Calibri" w:hAnsi="Century Gothic" w:cs="Calibri"/>
-          <w:sz w:val="18"/>
-          <w:szCs w:val="18"/>
-        </w:rPr>
-        <w:t>3. Advanced Compliance Automation — Stronger document-vs-hours discrepancy detection and at-risk escalation rules.</w:t>
-      </w:r>
-      <w:r>
-        <w:rPr>
-          <w:rFonts w:ascii="Century Gothic" w:eastAsia="Calibri" w:hAnsi="Century Gothic" w:cs="Calibri"/>
-          <w:sz w:val="18"/>
-          <w:szCs w:val="18"/>
-        </w:rPr>
-      </w:r>
-      <w:r>
-        <w:rPr>
-          <w:rFonts w:ascii="Century Gothic" w:eastAsia="Calibri" w:hAnsi="Century Gothic" w:cs="Calibri"/>
-          <w:sz w:val="18"/>
-          <w:szCs w:val="18"/>
-        </w:rPr>
-      </w:r>
-    </w:p>
-    <w:p>
-      <w:pPr>
-        <w:spacing w:before="40" w:after="40"/>
-        <w:ind w:left="480" w:hanging="240"/>
-        <w:rPr>
-          <w:rFonts w:ascii="Century Gothic" w:hAnsi="Century Gothic"/>
-          <w:sz w:val="18"/>
-          <w:szCs w:val="18"/>
-        </w:rPr>
-      </w:pPr>
-      <w:r>
-        <w:rPr>
-          <w:rFonts w:ascii="Century Gothic" w:eastAsia="Calibri" w:hAnsi="Century Gothic" w:cs="Calibri"/>
-          <w:sz w:val="18"/>
-          <w:szCs w:val="18"/>
-        </w:rPr>
-        <w:t>4. Certificate Automation — Fully automatic completion-certificate issuance and consolidated score workflows.</w:t>
-      </w:r>
-      <w:r>
-        <w:rPr>
-          <w:rFonts w:ascii="Century Gothic" w:eastAsia="Calibri" w:hAnsi="Century Gothic" w:cs="Calibri"/>
-          <w:sz w:val="18"/>
-          <w:szCs w:val="18"/>
-        </w:rPr>
-      </w:r>
-    </w:p>
-    <w:p>
-      <w:pPr>
-        <w:spacing w:before="40" w:after="40"/>
-        <w:ind w:left="480" w:hanging="240"/>
-        <w:rPr>
-          <w:rFonts w:ascii="Century Gothic" w:hAnsi="Century Gothic"/>
-          <w:sz w:val="18"/>
-          <w:szCs w:val="18"/>
-        </w:rPr>
-      </w:pPr>
-      <w:r>
-        <w:rPr>
-          <w:rFonts w:ascii="Century Gothic" w:eastAsia="Calibri" w:hAnsi="Century Gothic" w:cs="Calibri"/>
-          <w:sz w:val="18"/>
-          <w:szCs w:val="18"/>
-        </w:rPr>
-        <w:t>5. Broader Analytics — Deeper deployment/retention trend analytics for Director/Coordinator reporting.</w:t>
-      </w:r>
-      <w:r>
-        <w:rPr>
-          <w:rFonts w:ascii="Century Gothic" w:eastAsia="Calibri" w:hAnsi="Century Gothic" w:cs="Calibri"/>
-          <w:sz w:val="18"/>
-          <w:szCs w:val="18"/>
-        </w:rPr>
-      </w:r>
-      <w:r>
-        <w:rPr>
-          <w:rFonts w:ascii="Century Gothic" w:eastAsia="Calibri" w:hAnsi="Century Gothic" w:cs="Calibri"/>
-          <w:sz w:val="18"/>
-          <w:szCs w:val="18"/>
-        </w:rPr>
-      </w:r>
-    </w:p>
-    <w:p>
-      <w:pPr>
-        <w:spacing w:before="40" w:after="40"/>
-        <w:ind w:left="480" w:hanging="240"/>
-        <w:rPr>
-          <w:rFonts w:ascii="Century Gothic" w:hAnsi="Century Gothic"/>
-          <w:sz w:val="18"/>
-          <w:szCs w:val="18"/>
-        </w:rPr>
-      </w:pPr>
-      <w:r>
-        <w:rPr>
-          <w:rFonts w:ascii="Century Gothic" w:eastAsia="Calibri" w:hAnsi="Century Gothic" w:cs="Calibri"/>
-          <w:sz w:val="18"/>
-          <w:szCs w:val="18"/>
-        </w:rPr>
-        <w:t>6. Final UAT Polish — Cross-role acceptance testing, edge-case hardening, and deployment packaging.</w:t>
-      </w:r>
-      <w:r>
-        <w:rPr>
-          <w:rFonts w:ascii="Century Gothic" w:eastAsia="Calibri" w:hAnsi="Century Gothic" w:cs="Calibri"/>
-          <w:sz w:val="18"/>
-          <w:szCs w:val="18"/>
-        </w:rPr>
-      </w:r>
-      <w:r>
-        <w:rPr>
-          <w:rFonts w:ascii="Century Gothic" w:eastAsia="Calibri" w:hAnsi="Century Gothic" w:cs="Calibri"/>
-          <w:sz w:val="18"/>
-          <w:szCs w:val="18"/>
-        </w:rPr>
-      </w:r>
-    </w:p>
-    <w:p>
-      <w:pPr>
-        <w:spacing w:before="40" w:after="40"/>
-        <w:ind w:left="480" w:hanging="240"/>
-        <w:rPr>
-          <w:rFonts w:ascii="Century Gothic" w:eastAsia="Calibri" w:hAnsi="Century Gothic" w:cs="Calibri"/>
-          <w:sz w:val="18"/>
-          <w:szCs w:val="18"/>
-        </w:rPr>
-      </w:pPr>
-      <w:r>
-        <w:rPr>
-          <w:rFonts w:ascii="Century Gothic" w:eastAsia="Calibri" w:hAnsi="Century Gothic" w:cs="Calibri"/>
-          <w:sz w:val="18"/>
-          <w:szCs w:val="18"/>
-        </w:rPr>
-      </w:r>
-      <w:r>
-        <w:rPr>
-          <w:rFonts w:ascii="Century Gothic" w:eastAsia="Calibri" w:hAnsi="Century Gothic" w:cs="Calibri"/>
-          <w:sz w:val="18"/>
-          <w:szCs w:val="18"/>
-        </w:rPr>
-      </w:r>
-    </w:p>
-    <w:p>
-      <w:pPr>
-        <w:spacing w:before="40" w:after="40"/>
-        <w:ind w:left="480" w:hanging="240"/>
-        <w:rPr>
-          <w:rFonts w:ascii="Century Gothic" w:eastAsia="Calibri" w:hAnsi="Century Gothic" w:cs="Calibri"/>
-          <w:sz w:val="18"/>
-          <w:szCs w:val="18"/>
-        </w:rPr>
-      </w:pPr>
-      <w:r/>
-    </w:p>
-    <w:p>
-      <w:pPr>
-        <w:spacing w:before="300" w:after="100"/>
-        <w:rPr>
-          <w:rFonts w:ascii="Century Gothic" w:hAnsi="Century Gothic"/>
-          <w:sz w:val="18"/>
-          <w:szCs w:val="18"/>
-        </w:rPr>
-      </w:pPr>
-      <w:r>
         <w:rPr>
           <w:rFonts w:ascii="Century Gothic" w:eastAsia="Calibri" w:hAnsi="Century Gothic" w:cs="Calibri"/>
           <w:b/>
@@ -3040,9 +2238,12 @@
           <w:sz w:val="22"/>
           <w:szCs w:val="22"/>
         </w:rPr>
-        <w:t>Updated Adviser Consultation:</w:t>
-      </w:r>
-      <w:r>
+      </w:pPr>
+    </w:p>
+    <w:p>
+      <w:pPr>
+        <w:spacing w:before="40" w:after="40"/>
+        <w:ind w:left="480" w:hanging="240"/>
         <w:rPr>
           <w:rFonts w:ascii="Century Gothic" w:eastAsia="Calibri" w:hAnsi="Century Gothic" w:cs="Calibri"/>
           <w:b/>
@@ -3050,50 +2251,7 @@
           <w:sz w:val="22"/>
           <w:szCs w:val="22"/>
         </w:rPr>
-        <w:br/>
-      </w:r>
-      <w:r>
-        <w:rPr>
-          <w:rFonts w:ascii="Century Gothic" w:hAnsi="Century Gothic"/>
-          <w:sz w:val="18"/>
-          <w:szCs w:val="18"/>
-        </w:rPr>
-        <w:drawing>
-          <wp:inline distT="0" distB="0" distL="0" distR="0" wp14:anchorId="01D17B3C" wp14:editId="18E8597E">
-            <wp:extent cx="5943600" cy="4359910"/>
-            <wp:effectExtent l="0" t="0" r="0" b="2540"/>
-            <wp:docPr id="22" name="Picture 22"/>
-            <wp:cNvGraphicFramePr>
-              <a:graphicFrameLocks xmlns:a="http://schemas.openxmlformats.org/drawingml/2006/main" noChangeAspect="1"/>
-            </wp:cNvGraphicFramePr>
-            <a:graphic xmlns:a="http://schemas.openxmlformats.org/drawingml/2006/main">
-              <a:graphicData uri="http://schemas.openxmlformats.org/drawingml/2006/picture">
-                <pic:pic xmlns:pic="http://schemas.openxmlformats.org/drawingml/2006/picture">
-                  <pic:nvPicPr>
-                    <pic:cNvPr id="1" name=""/>
-                    <pic:cNvPicPr/>
-                  </pic:nvPicPr>
-                  <pic:blipFill>
-                    <a:blip r:embed="rId19"/>
-                    <a:stretch>
-                      <a:fillRect/>
-                    </a:stretch>
-                  </pic:blipFill>
-                  <pic:spPr>
-                    <a:xfrm>
-                      <a:off x="0" y="0"/>
-                      <a:ext cx="5943600" cy="4359910"/>
-                    </a:xfrm>
-                    <a:prstGeom prst="rect">
-                      <a:avLst/>
-                    </a:prstGeom>
-                  </pic:spPr>
-                </pic:pic>
-              </a:graphicData>
-            </a:graphic>
-          </wp:inline>
-        </w:drawing>
-      </w:r>
+      </w:pPr>
     </w:p>
     <w:p>
       <w:pPr>
@@ -3181,56 +2339,6 @@
           <w:rFonts w:ascii="Century Gothic" w:eastAsia="Calibri" w:hAnsi="Century Gothic" w:cs="Calibri"/>
           <w:b/>
           <w:bCs/>
-          <w:sz w:val="22"/>
-          <w:szCs w:val="22"/>
-        </w:rPr>
-      </w:pPr>
-    </w:p>
-    <w:p>
-      <w:pPr>
-        <w:spacing w:before="40" w:after="40"/>
-        <w:ind w:left="480" w:hanging="240"/>
-        <w:rPr>
-          <w:rFonts w:ascii="Century Gothic" w:eastAsia="Calibri" w:hAnsi="Century Gothic" w:cs="Calibri"/>
-          <w:b/>
-          <w:bCs/>
-          <w:sz w:val="22"/>
-          <w:szCs w:val="22"/>
-        </w:rPr>
-      </w:pPr>
-    </w:p>
-    <w:p>
-      <w:pPr>
-        <w:spacing w:before="40" w:after="40"/>
-        <w:ind w:left="480" w:hanging="240"/>
-        <w:rPr>
-          <w:rFonts w:ascii="Century Gothic" w:eastAsia="Calibri" w:hAnsi="Century Gothic" w:cs="Calibri"/>
-          <w:b/>
-          <w:bCs/>
-          <w:sz w:val="22"/>
-          <w:szCs w:val="22"/>
-        </w:rPr>
-      </w:pPr>
-      <w:r>
-        <w:rPr>
-          <w:rFonts w:ascii="Century Gothic" w:eastAsia="Calibri" w:hAnsi="Century Gothic" w:cs="Calibri"/>
-          <w:b/>
-          <w:bCs/>
-          <w:sz w:val="22"/>
-          <w:szCs w:val="22"/>
-        </w:rPr>
-        <w:lastRenderedPageBreak/>
-        <w:t>AI Checker:</w:t>
-      </w:r>
-    </w:p>
-    <w:p>
-      <w:pPr>
-        <w:spacing w:before="40" w:after="40"/>
-        <w:ind w:left="480" w:hanging="240"/>
-        <w:rPr>
-          <w:rFonts w:ascii="Century Gothic" w:eastAsia="Calibri" w:hAnsi="Century Gothic" w:cs="Calibri"/>
-          <w:b/>
-          <w:bCs/>
           <w:sz w:val="18"/>
           <w:szCs w:val="18"/>
         </w:rPr>
@@ -3247,48 +2355,6 @@
           <w:szCs w:val="18"/>
         </w:rPr>
       </w:pPr>
-      <w:r>
-        <w:rPr>
-          <w:rFonts w:ascii="Century Gothic" w:hAnsi="Century Gothic"/>
-          <w:sz w:val="18"/>
-          <w:szCs w:val="18"/>
-        </w:rPr>
-        <w:drawing>
-          <wp:inline distT="0" distB="0" distL="0" distR="0" wp14:anchorId="48AB2A66" wp14:editId="2F740992">
-            <wp:extent cx="3182620" cy="3122097"/>
-            <wp:effectExtent l="0" t="0" r="0" b="2540"/>
-            <wp:docPr id="23" name="Picture 23"/>
-            <wp:cNvGraphicFramePr>
-              <a:graphicFrameLocks xmlns:a="http://schemas.openxmlformats.org/drawingml/2006/main" noChangeAspect="1"/>
-            </wp:cNvGraphicFramePr>
-            <a:graphic xmlns:a="http://schemas.openxmlformats.org/drawingml/2006/main">
-              <a:graphicData uri="http://schemas.openxmlformats.org/drawingml/2006/picture">
-                <pic:pic xmlns:pic="http://schemas.openxmlformats.org/drawingml/2006/picture">
-                  <pic:nvPicPr>
-                    <pic:cNvPr id="1" name=""/>
-                    <pic:cNvPicPr/>
-                  </pic:nvPicPr>
-                  <pic:blipFill>
-                    <a:blip r:embed="rId20"/>
-                    <a:stretch>
-                      <a:fillRect/>
-                    </a:stretch>
-                  </pic:blipFill>
-                  <pic:spPr>
-                    <a:xfrm>
-                      <a:off x="0" y="0"/>
-                      <a:ext cx="3191328" cy="3130639"/>
-                    </a:xfrm>
-                    <a:prstGeom prst="rect">
-                      <a:avLst/>
-                    </a:prstGeom>
-                  </pic:spPr>
-                </pic:pic>
-              </a:graphicData>
-            </a:graphic>
-          </wp:inline>
-        </w:drawing>
-      </w:r>
     </w:p>
     <w:p>
       <w:pPr>
@@ -3308,48 +2374,6 @@
           <w:szCs w:val="18"/>
         </w:rPr>
       </w:pPr>
-      <w:r>
-        <w:rPr>
-          <w:rFonts w:ascii="Century Gothic" w:hAnsi="Century Gothic"/>
-          <w:sz w:val="18"/>
-          <w:szCs w:val="18"/>
-        </w:rPr>
-        <w:drawing>
-          <wp:inline distT="0" distB="0" distL="0" distR="0" wp14:anchorId="3C30EE15" wp14:editId="1ED34095">
-            <wp:extent cx="3143060" cy="3041650"/>
-            <wp:effectExtent l="0" t="0" r="635" b="6350"/>
-            <wp:docPr id="24" name="Picture 24"/>
-            <wp:cNvGraphicFramePr>
-              <a:graphicFrameLocks xmlns:a="http://schemas.openxmlformats.org/drawingml/2006/main" noChangeAspect="1"/>
-            </wp:cNvGraphicFramePr>
-            <a:graphic xmlns:a="http://schemas.openxmlformats.org/drawingml/2006/main">
-              <a:graphicData uri="http://schemas.openxmlformats.org/drawingml/2006/picture">
-                <pic:pic xmlns:pic="http://schemas.openxmlformats.org/drawingml/2006/picture">
-                  <pic:nvPicPr>
-                    <pic:cNvPr id="1" name=""/>
-                    <pic:cNvPicPr/>
-                  </pic:nvPicPr>
-                  <pic:blipFill>
-                    <a:blip r:embed="rId21"/>
-                    <a:stretch>
-                      <a:fillRect/>
-                    </a:stretch>
-                  </pic:blipFill>
-                  <pic:spPr>
-                    <a:xfrm>
-                      <a:off x="0" y="0"/>
-                      <a:ext cx="3159137" cy="3057209"/>
-                    </a:xfrm>
-                    <a:prstGeom prst="rect">
-                      <a:avLst/>
-                    </a:prstGeom>
-                  </pic:spPr>
-                </pic:pic>
-              </a:graphicData>
-            </a:graphic>
-          </wp:inline>
-        </w:drawing>
-      </w:r>
     </w:p>
     <w:p>
       <w:pPr>
@@ -3390,52 +2414,9 @@
           <w:szCs w:val="18"/>
         </w:rPr>
       </w:pPr>
-      <w:r>
-        <w:rPr>
-          <w:rFonts w:ascii="Century Gothic" w:hAnsi="Century Gothic"/>
-          <w:sz w:val="18"/>
-          <w:szCs w:val="18"/>
-        </w:rPr>
-        <w:lastRenderedPageBreak/>
-        <w:drawing>
-          <wp:inline distT="0" distB="0" distL="0" distR="0" wp14:anchorId="69D01761" wp14:editId="24904D94">
-            <wp:extent cx="3104194" cy="3067050"/>
-            <wp:effectExtent l="0" t="0" r="1270" b="0"/>
-            <wp:docPr id="26" name="Picture 26"/>
-            <wp:cNvGraphicFramePr>
-              <a:graphicFrameLocks xmlns:a="http://schemas.openxmlformats.org/drawingml/2006/main" noChangeAspect="1"/>
-            </wp:cNvGraphicFramePr>
-            <a:graphic xmlns:a="http://schemas.openxmlformats.org/drawingml/2006/main">
-              <a:graphicData uri="http://schemas.openxmlformats.org/drawingml/2006/picture">
-                <pic:pic xmlns:pic="http://schemas.openxmlformats.org/drawingml/2006/picture">
-                  <pic:nvPicPr>
-                    <pic:cNvPr id="1" name=""/>
-                    <pic:cNvPicPr/>
-                  </pic:nvPicPr>
-                  <pic:blipFill>
-                    <a:blip r:embed="rId22"/>
-                    <a:stretch>
-                      <a:fillRect/>
-                    </a:stretch>
-                  </pic:blipFill>
-                  <pic:spPr>
-                    <a:xfrm>
-                      <a:off x="0" y="0"/>
-                      <a:ext cx="3111934" cy="3074697"/>
-                    </a:xfrm>
-                    <a:prstGeom prst="rect">
-                      <a:avLst/>
-                    </a:prstGeom>
-                  </pic:spPr>
-                </pic:pic>
-              </a:graphicData>
-            </a:graphic>
-          </wp:inline>
-        </w:drawing>
-      </w:r>
     </w:p>
     <w:sectPr>
-      <w:headerReference w:type="default" r:id="rId23"/>
+      <w:headerReference w:type="default" r:id="rId7"/>
       <w:pgSz w:w="12240" w:h="15840"/>
       <w:pgMar w:top="1440" w:right="1440" w:bottom="1440" w:left="1440" w:header="720" w:footer="720" w:gutter="0"/>
       <w:cols w:space="720"/>
@@ -3508,12 +2489,6 @@
       <w:gridCol w:w="1200"/>
     </w:tblGrid>
     <w:tr>
-      <w:tblPrEx>
-        <w:tblCellMar>
-          <w:top w:w="0" w:type="dxa"/>
-          <w:bottom w:w="0" w:type="dxa"/>
-        </w:tblCellMar>
-      </w:tblPrEx>
       <w:trPr>
         <w:trHeight w:val="1080"/>
       </w:trPr>

</xml_diff>